<commit_message>
Add presentation prep briefings for Vidhi, Arnau and Rachel; fix deck section references
- New Word + Markdown briefings in easy language for Receiving (Vidhi),
  Picking (Arnau) and Shipping/value (Rachel): 60-second version, script,
  data, design, every number with its calculation, risks, Q&A, cheat sheet
- Glossary of plain-language terms added to all four briefings (incl. Gleb's)
- Deck source lines now point to the right report sections: costs D3 §7,
  cost register D3 §9, layout D2 §5, equipment D2 §6.3 and D3 §2.4
- Word converter keeps table columns at least one word wide

Co-Authored-By: Claude Opus 5.5 <noreply@anthropic.com>
Claude-Session: https://claude.ai/code/session_019BDu8Mejto8wmgVTUqspvV
</commit_message>
<xml_diff>
--- a/deliverables/presentation_prep/Storage_briefing_Gleb.docx
+++ b/deliverables/presentation_prep/Storage_briefing_Gleb.docx
@@ -28,7 +28,7 @@
           <w:sz w:val="21"/>
           <w:szCs w:val="21"/>
         </w:rPr>
-        <w:t xml:space="preserve">Everything about storage in one place: what the data shows, what we designed and why, every number with how we got it, the risks, and the questions you may get. All numbers come from the project's own analysis (Deliverables 1–3 and the deck), so they match the slides.</w:t>
+        <w:t xml:space="preserve">Everything about storage in one place: what the data shows, what we designed and why, every number with how we got it, the risks, and the questions you may get. The words that may be new are explained in the glossary at the end. All numbers come from the project's own analysis (Deliverables 1–3 and the deck), so they match the slides.</w:t>
       </w:r>
     </w:p>
     <w:p>
@@ -6821,9 +6821,9 @@
         <w:tblLayout w:type="fixed"/>
       </w:tblPr>
       <w:tblGrid>
-        <w:gridCol w:w="1317"/>
-        <w:gridCol w:w="4576"/>
-        <w:gridCol w:w="3745"/>
+        <w:gridCol w:w="1585"/>
+        <w:gridCol w:w="4428"/>
+        <w:gridCol w:w="3625"/>
       </w:tblGrid>
       <w:tr>
         <w:trPr>
@@ -6832,7 +6832,7 @@
         </w:trPr>
         <w:tc>
           <w:tcPr>
-            <w:tcW w:type="dxa" w:w="1317"/>
+            <w:tcW w:type="dxa" w:w="1585"/>
             <w:tcBorders>
               <w:top w:val="single" w:color="D9D9D9" w:sz="4"/>
               <w:left w:val="single" w:color="D9D9D9" w:sz="4"/>
@@ -6865,7 +6865,7 @@
         </w:tc>
         <w:tc>
           <w:tcPr>
-            <w:tcW w:type="dxa" w:w="4576"/>
+            <w:tcW w:type="dxa" w:w="4428"/>
             <w:tcBorders>
               <w:top w:val="single" w:color="D9D9D9" w:sz="4"/>
               <w:left w:val="single" w:color="D9D9D9" w:sz="4"/>
@@ -6898,7 +6898,7 @@
         </w:tc>
         <w:tc>
           <w:tcPr>
-            <w:tcW w:type="dxa" w:w="3745"/>
+            <w:tcW w:type="dxa" w:w="3625"/>
             <w:tcBorders>
               <w:top w:val="single" w:color="D9D9D9" w:sz="4"/>
               <w:left w:val="single" w:color="D9D9D9" w:sz="4"/>
@@ -6937,7 +6937,7 @@
         </w:trPr>
         <w:tc>
           <w:tcPr>
-            <w:tcW w:type="dxa" w:w="1317"/>
+            <w:tcW w:type="dxa" w:w="1585"/>
             <w:tcBorders>
               <w:top w:val="single" w:color="D9D9D9" w:sz="4"/>
               <w:left w:val="single" w:color="D9D9D9" w:sz="4"/>
@@ -6967,7 +6967,7 @@
         </w:tc>
         <w:tc>
           <w:tcPr>
-            <w:tcW w:type="dxa" w:w="4576"/>
+            <w:tcW w:type="dxa" w:w="4428"/>
             <w:tcBorders>
               <w:top w:val="single" w:color="D9D9D9" w:sz="4"/>
               <w:left w:val="single" w:color="D9D9D9" w:sz="4"/>
@@ -6997,7 +6997,7 @@
         </w:tc>
         <w:tc>
           <w:tcPr>
-            <w:tcW w:type="dxa" w:w="3745"/>
+            <w:tcW w:type="dxa" w:w="3625"/>
             <w:tcBorders>
               <w:top w:val="single" w:color="D9D9D9" w:sz="4"/>
               <w:left w:val="single" w:color="D9D9D9" w:sz="4"/>
@@ -7033,7 +7033,7 @@
         </w:trPr>
         <w:tc>
           <w:tcPr>
-            <w:tcW w:type="dxa" w:w="1317"/>
+            <w:tcW w:type="dxa" w:w="1585"/>
             <w:tcBorders>
               <w:top w:val="single" w:color="D9D9D9" w:sz="4"/>
               <w:left w:val="single" w:color="D9D9D9" w:sz="4"/>
@@ -7063,7 +7063,7 @@
         </w:tc>
         <w:tc>
           <w:tcPr>
-            <w:tcW w:type="dxa" w:w="4576"/>
+            <w:tcW w:type="dxa" w:w="4428"/>
             <w:tcBorders>
               <w:top w:val="single" w:color="D9D9D9" w:sz="4"/>
               <w:left w:val="single" w:color="D9D9D9" w:sz="4"/>
@@ -7093,7 +7093,7 @@
         </w:tc>
         <w:tc>
           <w:tcPr>
-            <w:tcW w:type="dxa" w:w="3745"/>
+            <w:tcW w:type="dxa" w:w="3625"/>
             <w:tcBorders>
               <w:top w:val="single" w:color="D9D9D9" w:sz="4"/>
               <w:left w:val="single" w:color="D9D9D9" w:sz="4"/>
@@ -7129,7 +7129,7 @@
         </w:trPr>
         <w:tc>
           <w:tcPr>
-            <w:tcW w:type="dxa" w:w="1317"/>
+            <w:tcW w:type="dxa" w:w="1585"/>
             <w:tcBorders>
               <w:top w:val="single" w:color="D9D9D9" w:sz="4"/>
               <w:left w:val="single" w:color="D9D9D9" w:sz="4"/>
@@ -7159,7 +7159,7 @@
         </w:tc>
         <w:tc>
           <w:tcPr>
-            <w:tcW w:type="dxa" w:w="4576"/>
+            <w:tcW w:type="dxa" w:w="4428"/>
             <w:tcBorders>
               <w:top w:val="single" w:color="D9D9D9" w:sz="4"/>
               <w:left w:val="single" w:color="D9D9D9" w:sz="4"/>
@@ -7189,7 +7189,7 @@
         </w:tc>
         <w:tc>
           <w:tcPr>
-            <w:tcW w:type="dxa" w:w="3745"/>
+            <w:tcW w:type="dxa" w:w="3625"/>
             <w:tcBorders>
               <w:top w:val="single" w:color="D9D9D9" w:sz="4"/>
               <w:left w:val="single" w:color="D9D9D9" w:sz="4"/>
@@ -7225,7 +7225,7 @@
         </w:trPr>
         <w:tc>
           <w:tcPr>
-            <w:tcW w:type="dxa" w:w="1317"/>
+            <w:tcW w:type="dxa" w:w="1585"/>
             <w:tcBorders>
               <w:top w:val="single" w:color="D9D9D9" w:sz="4"/>
               <w:left w:val="single" w:color="D9D9D9" w:sz="4"/>
@@ -7255,7 +7255,7 @@
         </w:tc>
         <w:tc>
           <w:tcPr>
-            <w:tcW w:type="dxa" w:w="4576"/>
+            <w:tcW w:type="dxa" w:w="4428"/>
             <w:tcBorders>
               <w:top w:val="single" w:color="D9D9D9" w:sz="4"/>
               <w:left w:val="single" w:color="D9D9D9" w:sz="4"/>
@@ -7285,7 +7285,7 @@
         </w:tc>
         <w:tc>
           <w:tcPr>
-            <w:tcW w:type="dxa" w:w="3745"/>
+            <w:tcW w:type="dxa" w:w="3625"/>
             <w:tcBorders>
               <w:top w:val="single" w:color="D9D9D9" w:sz="4"/>
               <w:left w:val="single" w:color="D9D9D9" w:sz="4"/>
@@ -7321,7 +7321,7 @@
         </w:trPr>
         <w:tc>
           <w:tcPr>
-            <w:tcW w:type="dxa" w:w="1317"/>
+            <w:tcW w:type="dxa" w:w="1585"/>
             <w:tcBorders>
               <w:top w:val="single" w:color="D9D9D9" w:sz="4"/>
               <w:left w:val="single" w:color="D9D9D9" w:sz="4"/>
@@ -7351,7 +7351,7 @@
         </w:tc>
         <w:tc>
           <w:tcPr>
-            <w:tcW w:type="dxa" w:w="4576"/>
+            <w:tcW w:type="dxa" w:w="4428"/>
             <w:tcBorders>
               <w:top w:val="single" w:color="D9D9D9" w:sz="4"/>
               <w:left w:val="single" w:color="D9D9D9" w:sz="4"/>
@@ -7391,7 +7391,7 @@
         </w:tc>
         <w:tc>
           <w:tcPr>
-            <w:tcW w:type="dxa" w:w="3745"/>
+            <w:tcW w:type="dxa" w:w="3625"/>
             <w:tcBorders>
               <w:top w:val="single" w:color="D9D9D9" w:sz="4"/>
               <w:left w:val="single" w:color="D9D9D9" w:sz="4"/>
@@ -7457,11 +7457,11 @@
         <w:tblLayout w:type="fixed"/>
       </w:tblPr>
       <w:tblGrid>
-        <w:gridCol w:w="1733"/>
-        <w:gridCol w:w="2912"/>
-        <w:gridCol w:w="2982"/>
-        <w:gridCol w:w="1179"/>
-        <w:gridCol w:w="832"/>
+        <w:gridCol w:w="1731"/>
+        <w:gridCol w:w="2905"/>
+        <w:gridCol w:w="2974"/>
+        <w:gridCol w:w="1178"/>
+        <w:gridCol w:w="850"/>
       </w:tblGrid>
       <w:tr>
         <w:trPr>
@@ -7470,7 +7470,7 @@
         </w:trPr>
         <w:tc>
           <w:tcPr>
-            <w:tcW w:type="dxa" w:w="1733"/>
+            <w:tcW w:type="dxa" w:w="1731"/>
             <w:tcBorders>
               <w:top w:val="single" w:color="D9D9D9" w:sz="4"/>
               <w:left w:val="single" w:color="D9D9D9" w:sz="4"/>
@@ -7503,7 +7503,7 @@
         </w:tc>
         <w:tc>
           <w:tcPr>
-            <w:tcW w:type="dxa" w:w="2912"/>
+            <w:tcW w:type="dxa" w:w="2905"/>
             <w:tcBorders>
               <w:top w:val="single" w:color="D9D9D9" w:sz="4"/>
               <w:left w:val="single" w:color="D9D9D9" w:sz="4"/>
@@ -7536,7 +7536,7 @@
         </w:tc>
         <w:tc>
           <w:tcPr>
-            <w:tcW w:type="dxa" w:w="2982"/>
+            <w:tcW w:type="dxa" w:w="2974"/>
             <w:tcBorders>
               <w:top w:val="single" w:color="D9D9D9" w:sz="4"/>
               <w:left w:val="single" w:color="D9D9D9" w:sz="4"/>
@@ -7569,7 +7569,7 @@
         </w:tc>
         <w:tc>
           <w:tcPr>
-            <w:tcW w:type="dxa" w:w="1179"/>
+            <w:tcW w:type="dxa" w:w="1178"/>
             <w:tcBorders>
               <w:top w:val="single" w:color="D9D9D9" w:sz="4"/>
               <w:left w:val="single" w:color="D9D9D9" w:sz="4"/>
@@ -7602,7 +7602,7 @@
         </w:tc>
         <w:tc>
           <w:tcPr>
-            <w:tcW w:type="dxa" w:w="832"/>
+            <w:tcW w:type="dxa" w:w="850"/>
             <w:tcBorders>
               <w:top w:val="single" w:color="D9D9D9" w:sz="4"/>
               <w:left w:val="single" w:color="D9D9D9" w:sz="4"/>
@@ -7641,7 +7641,7 @@
         </w:trPr>
         <w:tc>
           <w:tcPr>
-            <w:tcW w:type="dxa" w:w="1733"/>
+            <w:tcW w:type="dxa" w:w="1731"/>
             <w:tcBorders>
               <w:top w:val="single" w:color="D9D9D9" w:sz="4"/>
               <w:left w:val="single" w:color="D9D9D9" w:sz="4"/>
@@ -7671,7 +7671,7 @@
         </w:tc>
         <w:tc>
           <w:tcPr>
-            <w:tcW w:type="dxa" w:w="2912"/>
+            <w:tcW w:type="dxa" w:w="2905"/>
             <w:tcBorders>
               <w:top w:val="single" w:color="D9D9D9" w:sz="4"/>
               <w:left w:val="single" w:color="D9D9D9" w:sz="4"/>
@@ -7701,7 +7701,7 @@
         </w:tc>
         <w:tc>
           <w:tcPr>
-            <w:tcW w:type="dxa" w:w="2982"/>
+            <w:tcW w:type="dxa" w:w="2974"/>
             <w:tcBorders>
               <w:top w:val="single" w:color="D9D9D9" w:sz="4"/>
               <w:left w:val="single" w:color="D9D9D9" w:sz="4"/>
@@ -7733,7 +7733,7 @@
         </w:tc>
         <w:tc>
           <w:tcPr>
-            <w:tcW w:type="dxa" w:w="1179"/>
+            <w:tcW w:type="dxa" w:w="1178"/>
             <w:tcBorders>
               <w:top w:val="single" w:color="D9D9D9" w:sz="4"/>
               <w:left w:val="single" w:color="D9D9D9" w:sz="4"/>
@@ -7763,7 +7763,7 @@
         </w:tc>
         <w:tc>
           <w:tcPr>
-            <w:tcW w:type="dxa" w:w="832"/>
+            <w:tcW w:type="dxa" w:w="850"/>
             <w:tcBorders>
               <w:top w:val="single" w:color="D9D9D9" w:sz="4"/>
               <w:left w:val="single" w:color="D9D9D9" w:sz="4"/>
@@ -7799,7 +7799,7 @@
         </w:trPr>
         <w:tc>
           <w:tcPr>
-            <w:tcW w:type="dxa" w:w="1733"/>
+            <w:tcW w:type="dxa" w:w="1731"/>
             <w:tcBorders>
               <w:top w:val="single" w:color="D9D9D9" w:sz="4"/>
               <w:left w:val="single" w:color="D9D9D9" w:sz="4"/>
@@ -7831,7 +7831,7 @@
         </w:tc>
         <w:tc>
           <w:tcPr>
-            <w:tcW w:type="dxa" w:w="2912"/>
+            <w:tcW w:type="dxa" w:w="2905"/>
             <w:tcBorders>
               <w:top w:val="single" w:color="D9D9D9" w:sz="4"/>
               <w:left w:val="single" w:color="D9D9D9" w:sz="4"/>
@@ -7861,7 +7861,7 @@
         </w:tc>
         <w:tc>
           <w:tcPr>
-            <w:tcW w:type="dxa" w:w="2982"/>
+            <w:tcW w:type="dxa" w:w="2974"/>
             <w:tcBorders>
               <w:top w:val="single" w:color="D9D9D9" w:sz="4"/>
               <w:left w:val="single" w:color="D9D9D9" w:sz="4"/>
@@ -7901,7 +7901,7 @@
         </w:tc>
         <w:tc>
           <w:tcPr>
-            <w:tcW w:type="dxa" w:w="1179"/>
+            <w:tcW w:type="dxa" w:w="1178"/>
             <w:tcBorders>
               <w:top w:val="single" w:color="D9D9D9" w:sz="4"/>
               <w:left w:val="single" w:color="D9D9D9" w:sz="4"/>
@@ -7931,7 +7931,7 @@
         </w:tc>
         <w:tc>
           <w:tcPr>
-            <w:tcW w:type="dxa" w:w="832"/>
+            <w:tcW w:type="dxa" w:w="850"/>
             <w:tcBorders>
               <w:top w:val="single" w:color="D9D9D9" w:sz="4"/>
               <w:left w:val="single" w:color="D9D9D9" w:sz="4"/>
@@ -7969,7 +7969,7 @@
         </w:trPr>
         <w:tc>
           <w:tcPr>
-            <w:tcW w:type="dxa" w:w="1733"/>
+            <w:tcW w:type="dxa" w:w="1731"/>
             <w:tcBorders>
               <w:top w:val="single" w:color="D9D9D9" w:sz="4"/>
               <w:left w:val="single" w:color="D9D9D9" w:sz="4"/>
@@ -7999,7 +7999,7 @@
         </w:tc>
         <w:tc>
           <w:tcPr>
-            <w:tcW w:type="dxa" w:w="2912"/>
+            <w:tcW w:type="dxa" w:w="2905"/>
             <w:tcBorders>
               <w:top w:val="single" w:color="D9D9D9" w:sz="4"/>
               <w:left w:val="single" w:color="D9D9D9" w:sz="4"/>
@@ -8029,7 +8029,7 @@
         </w:tc>
         <w:tc>
           <w:tcPr>
-            <w:tcW w:type="dxa" w:w="2982"/>
+            <w:tcW w:type="dxa" w:w="2974"/>
             <w:tcBorders>
               <w:top w:val="single" w:color="D9D9D9" w:sz="4"/>
               <w:left w:val="single" w:color="D9D9D9" w:sz="4"/>
@@ -8059,7 +8059,7 @@
         </w:tc>
         <w:tc>
           <w:tcPr>
-            <w:tcW w:type="dxa" w:w="1179"/>
+            <w:tcW w:type="dxa" w:w="1178"/>
             <w:tcBorders>
               <w:top w:val="single" w:color="D9D9D9" w:sz="4"/>
               <w:left w:val="single" w:color="D9D9D9" w:sz="4"/>
@@ -8089,7 +8089,7 @@
         </w:tc>
         <w:tc>
           <w:tcPr>
-            <w:tcW w:type="dxa" w:w="832"/>
+            <w:tcW w:type="dxa" w:w="850"/>
             <w:tcBorders>
               <w:top w:val="single" w:color="D9D9D9" w:sz="4"/>
               <w:left w:val="single" w:color="D9D9D9" w:sz="4"/>
@@ -8125,7 +8125,7 @@
         </w:trPr>
         <w:tc>
           <w:tcPr>
-            <w:tcW w:type="dxa" w:w="1733"/>
+            <w:tcW w:type="dxa" w:w="1731"/>
             <w:tcBorders>
               <w:top w:val="single" w:color="D9D9D9" w:sz="4"/>
               <w:left w:val="single" w:color="D9D9D9" w:sz="4"/>
@@ -8155,7 +8155,7 @@
         </w:tc>
         <w:tc>
           <w:tcPr>
-            <w:tcW w:type="dxa" w:w="2912"/>
+            <w:tcW w:type="dxa" w:w="2905"/>
             <w:tcBorders>
               <w:top w:val="single" w:color="D9D9D9" w:sz="4"/>
               <w:left w:val="single" w:color="D9D9D9" w:sz="4"/>
@@ -8185,7 +8185,7 @@
         </w:tc>
         <w:tc>
           <w:tcPr>
-            <w:tcW w:type="dxa" w:w="2982"/>
+            <w:tcW w:type="dxa" w:w="2974"/>
             <w:tcBorders>
               <w:top w:val="single" w:color="D9D9D9" w:sz="4"/>
               <w:left w:val="single" w:color="D9D9D9" w:sz="4"/>
@@ -8215,7 +8215,7 @@
         </w:tc>
         <w:tc>
           <w:tcPr>
-            <w:tcW w:type="dxa" w:w="1179"/>
+            <w:tcW w:type="dxa" w:w="1178"/>
             <w:tcBorders>
               <w:top w:val="single" w:color="D9D9D9" w:sz="4"/>
               <w:left w:val="single" w:color="D9D9D9" w:sz="4"/>
@@ -8245,7 +8245,7 @@
         </w:tc>
         <w:tc>
           <w:tcPr>
-            <w:tcW w:type="dxa" w:w="832"/>
+            <w:tcW w:type="dxa" w:w="850"/>
             <w:tcBorders>
               <w:top w:val="single" w:color="D9D9D9" w:sz="4"/>
               <w:left w:val="single" w:color="D9D9D9" w:sz="4"/>
@@ -15346,6 +15346,3418 @@
                 <w:szCs w:val="18"/>
               </w:rPr>
               <w:t xml:space="preserve"> of €1.63M (racks €130/place); re-use option → €0.52M total</w:t>
+            </w:r>
+          </w:p>
+        </w:tc>
+      </w:tr>
+    </w:tbl>
+    <w:p>
+      <w:pPr>
+        <w:spacing w:after="80" w:before="0"/>
+      </w:pPr>
+    </w:p>
+    <w:p>
+      <w:pPr>
+        <w:pStyle w:val="Heading1"/>
+        <w:keepNext/>
+        <w:pBdr>
+          <w:bottom w:val="single" w:color="D40511" w:sz="6" w:space="4"/>
+        </w:pBdr>
+        <w:spacing w:after="120" w:before="320"/>
+      </w:pPr>
+      <w:r>
+        <w:rPr>
+          <w:b/>
+          <w:bCs/>
+          <w:color w:val="1A1A1A"/>
+          <w:sz w:val="28"/>
+          <w:szCs w:val="28"/>
+        </w:rPr>
+        <w:t xml:space="preserve">12. Glossary — the words in plain language</w:t>
+      </w:r>
+    </w:p>
+    <w:p>
+      <w:pPr>
+        <w:pStyle w:val="Heading2"/>
+        <w:keepNext/>
+        <w:spacing w:after="80" w:before="220"/>
+      </w:pPr>
+      <w:r>
+        <w:rPr>
+          <w:b/>
+          <w:bCs/>
+          <w:color w:val="D40511"/>
+          <w:sz w:val="23"/>
+          <w:szCs w:val="23"/>
+        </w:rPr>
+        <w:t xml:space="preserve">Storage words</w:t>
+      </w:r>
+    </w:p>
+    <w:tbl>
+      <w:tblPr>
+        <w:tblW w:type="dxa" w:w="9638"/>
+        <w:tblBorders>
+          <w:top w:val="single" w:color="auto" w:sz="4"/>
+          <w:left w:val="single" w:color="auto" w:sz="4"/>
+          <w:bottom w:val="single" w:color="auto" w:sz="4"/>
+          <w:right w:val="single" w:color="auto" w:sz="4"/>
+          <w:insideH w:val="single" w:color="auto" w:sz="4"/>
+          <w:insideV w:val="single" w:color="auto" w:sz="4"/>
+        </w:tblBorders>
+        <w:tblLayout w:type="fixed"/>
+      </w:tblPr>
+      <w:tblGrid>
+        <w:gridCol w:w="3147"/>
+        <w:gridCol w:w="6491"/>
+      </w:tblGrid>
+      <w:tr>
+        <w:trPr>
+          <w:cantSplit/>
+          <w:tblHeader/>
+        </w:trPr>
+        <w:tc>
+          <w:tcPr>
+            <w:tcW w:type="dxa" w:w="3147"/>
+            <w:tcBorders>
+              <w:top w:val="single" w:color="D9D9D9" w:sz="4"/>
+              <w:left w:val="single" w:color="D9D9D9" w:sz="4"/>
+              <w:bottom w:val="single" w:color="D9D9D9" w:sz="4"/>
+              <w:right w:val="single" w:color="D9D9D9" w:sz="4"/>
+            </w:tcBorders>
+            <w:shd w:fill="F2F2F2" w:color="auto" w:val="clear"/>
+            <w:tcMar>
+              <w:top w:type="dxa" w:w="50"/>
+              <w:left w:type="dxa" w:w="90"/>
+              <w:bottom w:type="dxa" w:w="50"/>
+              <w:right w:type="dxa" w:w="90"/>
+            </w:tcMar>
+          </w:tcPr>
+          <w:p>
+            <w:pPr>
+              <w:spacing w:after="0" w:before="0"/>
+            </w:pPr>
+            <w:r>
+              <w:rPr>
+                <w:b/>
+                <w:bCs/>
+                <w:color w:val="595959"/>
+                <w:sz w:val="18"/>
+                <w:szCs w:val="18"/>
+              </w:rPr>
+              <w:t xml:space="preserve">Word</w:t>
+            </w:r>
+          </w:p>
+        </w:tc>
+        <w:tc>
+          <w:tcPr>
+            <w:tcW w:type="dxa" w:w="6491"/>
+            <w:tcBorders>
+              <w:top w:val="single" w:color="D9D9D9" w:sz="4"/>
+              <w:left w:val="single" w:color="D9D9D9" w:sz="4"/>
+              <w:bottom w:val="single" w:color="D9D9D9" w:sz="4"/>
+              <w:right w:val="single" w:color="D9D9D9" w:sz="4"/>
+            </w:tcBorders>
+            <w:shd w:fill="F2F2F2" w:color="auto" w:val="clear"/>
+            <w:tcMar>
+              <w:top w:type="dxa" w:w="50"/>
+              <w:left w:type="dxa" w:w="90"/>
+              <w:bottom w:type="dxa" w:w="50"/>
+              <w:right w:type="dxa" w:w="90"/>
+            </w:tcMar>
+          </w:tcPr>
+          <w:p>
+            <w:pPr>
+              <w:spacing w:after="0" w:before="0"/>
+            </w:pPr>
+            <w:r>
+              <w:rPr>
+                <w:b/>
+                <w:bCs/>
+                <w:color w:val="595959"/>
+                <w:sz w:val="18"/>
+                <w:szCs w:val="18"/>
+              </w:rPr>
+              <w:t xml:space="preserve">What it means</w:t>
+            </w:r>
+          </w:p>
+        </w:tc>
+      </w:tr>
+      <w:tr>
+        <w:trPr>
+          <w:cantSplit/>
+          <w:tblHeader w:val="false"/>
+        </w:trPr>
+        <w:tc>
+          <w:tcPr>
+            <w:tcW w:type="dxa" w:w="3147"/>
+            <w:tcBorders>
+              <w:top w:val="single" w:color="D9D9D9" w:sz="4"/>
+              <w:left w:val="single" w:color="D9D9D9" w:sz="4"/>
+              <w:bottom w:val="single" w:color="D9D9D9" w:sz="4"/>
+              <w:right w:val="single" w:color="D9D9D9" w:sz="4"/>
+            </w:tcBorders>
+            <w:tcMar>
+              <w:top w:type="dxa" w:w="50"/>
+              <w:left w:type="dxa" w:w="90"/>
+              <w:bottom w:type="dxa" w:w="50"/>
+              <w:right w:type="dxa" w:w="90"/>
+            </w:tcMar>
+          </w:tcPr>
+          <w:p>
+            <w:pPr>
+              <w:spacing w:after="0" w:before="0"/>
+            </w:pPr>
+            <w:r>
+              <w:rPr>
+                <w:color w:val="1A1A1A"/>
+                <w:sz w:val="18"/>
+                <w:szCs w:val="18"/>
+              </w:rPr>
+              <w:t xml:space="preserve">Reach truck</w:t>
+            </w:r>
+          </w:p>
+        </w:tc>
+        <w:tc>
+          <w:tcPr>
+            <w:tcW w:type="dxa" w:w="6491"/>
+            <w:tcBorders>
+              <w:top w:val="single" w:color="D9D9D9" w:sz="4"/>
+              <w:left w:val="single" w:color="D9D9D9" w:sz="4"/>
+              <w:bottom w:val="single" w:color="D9D9D9" w:sz="4"/>
+              <w:right w:val="single" w:color="D9D9D9" w:sz="4"/>
+            </w:tcBorders>
+            <w:tcMar>
+              <w:top w:type="dxa" w:w="50"/>
+              <w:left w:type="dxa" w:w="90"/>
+              <w:bottom w:type="dxa" w:w="50"/>
+              <w:right w:type="dxa" w:w="90"/>
+            </w:tcMar>
+          </w:tcPr>
+          <w:p>
+            <w:pPr>
+              <w:spacing w:after="0" w:before="0"/>
+            </w:pPr>
+            <w:r>
+              <w:rPr>
+                <w:color w:val="1A1A1A"/>
+                <w:sz w:val="18"/>
+                <w:szCs w:val="18"/>
+              </w:rPr>
+              <w:t xml:space="preserve">a truck whose forks reach forward to put pallets into high racks (the ETV 216i)</w:t>
+            </w:r>
+          </w:p>
+        </w:tc>
+      </w:tr>
+      <w:tr>
+        <w:trPr>
+          <w:cantSplit/>
+          <w:tblHeader w:val="false"/>
+        </w:trPr>
+        <w:tc>
+          <w:tcPr>
+            <w:tcW w:type="dxa" w:w="3147"/>
+            <w:tcBorders>
+              <w:top w:val="single" w:color="D9D9D9" w:sz="4"/>
+              <w:left w:val="single" w:color="D9D9D9" w:sz="4"/>
+              <w:bottom w:val="single" w:color="D9D9D9" w:sz="4"/>
+              <w:right w:val="single" w:color="D9D9D9" w:sz="4"/>
+            </w:tcBorders>
+            <w:tcMar>
+              <w:top w:type="dxa" w:w="50"/>
+              <w:left w:type="dxa" w:w="90"/>
+              <w:bottom w:type="dxa" w:w="50"/>
+              <w:right w:type="dxa" w:w="90"/>
+            </w:tcMar>
+          </w:tcPr>
+          <w:p>
+            <w:pPr>
+              <w:spacing w:after="0" w:before="0"/>
+            </w:pPr>
+            <w:r>
+              <w:rPr>
+                <w:color w:val="1A1A1A"/>
+                <w:sz w:val="18"/>
+                <w:szCs w:val="18"/>
+              </w:rPr>
+              <w:t xml:space="preserve">Back-to-back racks</w:t>
+            </w:r>
+          </w:p>
+        </w:tc>
+        <w:tc>
+          <w:tcPr>
+            <w:tcW w:type="dxa" w:w="6491"/>
+            <w:tcBorders>
+              <w:top w:val="single" w:color="D9D9D9" w:sz="4"/>
+              <w:left w:val="single" w:color="D9D9D9" w:sz="4"/>
+              <w:bottom w:val="single" w:color="D9D9D9" w:sz="4"/>
+              <w:right w:val="single" w:color="D9D9D9" w:sz="4"/>
+            </w:tcBorders>
+            <w:tcMar>
+              <w:top w:type="dxa" w:w="50"/>
+              <w:left w:type="dxa" w:w="90"/>
+              <w:bottom w:type="dxa" w:w="50"/>
+              <w:right w:type="dxa" w:w="90"/>
+            </w:tcMar>
+          </w:tcPr>
+          <w:p>
+            <w:pPr>
+              <w:spacing w:after="0" w:before="0"/>
+            </w:pPr>
+            <w:r>
+              <w:rPr>
+                <w:color w:val="1A1A1A"/>
+                <w:sz w:val="18"/>
+                <w:szCs w:val="18"/>
+              </w:rPr>
+              <w:t xml:space="preserve">two rows of single-deep racks standing against each other, each facing its own aisle</w:t>
+            </w:r>
+          </w:p>
+        </w:tc>
+      </w:tr>
+      <w:tr>
+        <w:trPr>
+          <w:cantSplit/>
+          <w:tblHeader w:val="false"/>
+        </w:trPr>
+        <w:tc>
+          <w:tcPr>
+            <w:tcW w:type="dxa" w:w="3147"/>
+            <w:tcBorders>
+              <w:top w:val="single" w:color="D9D9D9" w:sz="4"/>
+              <w:left w:val="single" w:color="D9D9D9" w:sz="4"/>
+              <w:bottom w:val="single" w:color="D9D9D9" w:sz="4"/>
+              <w:right w:val="single" w:color="D9D9D9" w:sz="4"/>
+            </w:tcBorders>
+            <w:tcMar>
+              <w:top w:type="dxa" w:w="50"/>
+              <w:left w:type="dxa" w:w="90"/>
+              <w:bottom w:type="dxa" w:w="50"/>
+              <w:right w:type="dxa" w:w="90"/>
+            </w:tcMar>
+          </w:tcPr>
+          <w:p>
+            <w:pPr>
+              <w:spacing w:after="0" w:before="0"/>
+            </w:pPr>
+            <w:r>
+              <w:rPr>
+                <w:color w:val="1A1A1A"/>
+                <w:sz w:val="18"/>
+                <w:szCs w:val="18"/>
+              </w:rPr>
+              <w:t xml:space="preserve">Double-deep rack</w:t>
+            </w:r>
+          </w:p>
+        </w:tc>
+        <w:tc>
+          <w:tcPr>
+            <w:tcW w:type="dxa" w:w="6491"/>
+            <w:tcBorders>
+              <w:top w:val="single" w:color="D9D9D9" w:sz="4"/>
+              <w:left w:val="single" w:color="D9D9D9" w:sz="4"/>
+              <w:bottom w:val="single" w:color="D9D9D9" w:sz="4"/>
+              <w:right w:val="single" w:color="D9D9D9" w:sz="4"/>
+            </w:tcBorders>
+            <w:tcMar>
+              <w:top w:type="dxa" w:w="50"/>
+              <w:left w:type="dxa" w:w="90"/>
+              <w:bottom w:type="dxa" w:w="50"/>
+              <w:right w:type="dxa" w:w="90"/>
+            </w:tcMar>
+          </w:tcPr>
+          <w:p>
+            <w:pPr>
+              <w:spacing w:after="0" w:before="0"/>
+            </w:pPr>
+            <w:r>
+              <w:rPr>
+                <w:color w:val="1A1A1A"/>
+                <w:sz w:val="18"/>
+                <w:szCs w:val="18"/>
+              </w:rPr>
+              <w:t xml:space="preserve">two pallets behind each other; the back one can only be reached by moving the front one (not chosen)</w:t>
+            </w:r>
+          </w:p>
+        </w:tc>
+      </w:tr>
+      <w:tr>
+        <w:trPr>
+          <w:cantSplit/>
+          <w:tblHeader w:val="false"/>
+        </w:trPr>
+        <w:tc>
+          <w:tcPr>
+            <w:tcW w:type="dxa" w:w="3147"/>
+            <w:tcBorders>
+              <w:top w:val="single" w:color="D9D9D9" w:sz="4"/>
+              <w:left w:val="single" w:color="D9D9D9" w:sz="4"/>
+              <w:bottom w:val="single" w:color="D9D9D9" w:sz="4"/>
+              <w:right w:val="single" w:color="D9D9D9" w:sz="4"/>
+            </w:tcBorders>
+            <w:tcMar>
+              <w:top w:type="dxa" w:w="50"/>
+              <w:left w:type="dxa" w:w="90"/>
+              <w:bottom w:type="dxa" w:w="50"/>
+              <w:right w:type="dxa" w:w="90"/>
+            </w:tcMar>
+          </w:tcPr>
+          <w:p>
+            <w:pPr>
+              <w:spacing w:after="0" w:before="0"/>
+            </w:pPr>
+            <w:r>
+              <w:rPr>
+                <w:color w:val="1A1A1A"/>
+                <w:sz w:val="18"/>
+                <w:szCs w:val="18"/>
+              </w:rPr>
+              <w:t xml:space="preserve">Level / beam</w:t>
+            </w:r>
+          </w:p>
+        </w:tc>
+        <w:tc>
+          <w:tcPr>
+            <w:tcW w:type="dxa" w:w="6491"/>
+            <w:tcBorders>
+              <w:top w:val="single" w:color="D9D9D9" w:sz="4"/>
+              <w:left w:val="single" w:color="D9D9D9" w:sz="4"/>
+              <w:bottom w:val="single" w:color="D9D9D9" w:sz="4"/>
+              <w:right w:val="single" w:color="D9D9D9" w:sz="4"/>
+            </w:tcBorders>
+            <w:tcMar>
+              <w:top w:type="dxa" w:w="50"/>
+              <w:left w:type="dxa" w:w="90"/>
+              <w:bottom w:type="dxa" w:w="50"/>
+              <w:right w:type="dxa" w:w="90"/>
+            </w:tcMar>
+          </w:tcPr>
+          <w:p>
+            <w:pPr>
+              <w:spacing w:after="0" w:before="0"/>
+            </w:pPr>
+            <w:r>
+              <w:rPr>
+                <w:color w:val="1A1A1A"/>
+                <w:sz w:val="18"/>
+                <w:szCs w:val="18"/>
+              </w:rPr>
+              <w:t xml:space="preserve">a level is one floor of the rack; the beam is the horizontal bar the pallets stand on</w:t>
+            </w:r>
+          </w:p>
+        </w:tc>
+      </w:tr>
+      <w:tr>
+        <w:trPr>
+          <w:cantSplit/>
+          <w:tblHeader w:val="false"/>
+        </w:trPr>
+        <w:tc>
+          <w:tcPr>
+            <w:tcW w:type="dxa" w:w="3147"/>
+            <w:tcBorders>
+              <w:top w:val="single" w:color="D9D9D9" w:sz="4"/>
+              <w:left w:val="single" w:color="D9D9D9" w:sz="4"/>
+              <w:bottom w:val="single" w:color="D9D9D9" w:sz="4"/>
+              <w:right w:val="single" w:color="D9D9D9" w:sz="4"/>
+            </w:tcBorders>
+            <w:tcMar>
+              <w:top w:type="dxa" w:w="50"/>
+              <w:left w:type="dxa" w:w="90"/>
+              <w:bottom w:type="dxa" w:w="50"/>
+              <w:right w:type="dxa" w:w="90"/>
+            </w:tcMar>
+          </w:tcPr>
+          <w:p>
+            <w:pPr>
+              <w:spacing w:after="0" w:before="0"/>
+            </w:pPr>
+            <w:r>
+              <w:rPr>
+                <w:color w:val="1A1A1A"/>
+                <w:sz w:val="18"/>
+                <w:szCs w:val="18"/>
+              </w:rPr>
+              <w:t xml:space="preserve">Load centre</w:t>
+            </w:r>
+          </w:p>
+        </w:tc>
+        <w:tc>
+          <w:tcPr>
+            <w:tcW w:type="dxa" w:w="6491"/>
+            <w:tcBorders>
+              <w:top w:val="single" w:color="D9D9D9" w:sz="4"/>
+              <w:left w:val="single" w:color="D9D9D9" w:sz="4"/>
+              <w:bottom w:val="single" w:color="D9D9D9" w:sz="4"/>
+              <w:right w:val="single" w:color="D9D9D9" w:sz="4"/>
+            </w:tcBorders>
+            <w:tcMar>
+              <w:top w:type="dxa" w:w="50"/>
+              <w:left w:type="dxa" w:w="90"/>
+              <w:bottom w:type="dxa" w:w="50"/>
+              <w:right w:type="dxa" w:w="90"/>
+            </w:tcMar>
+          </w:tcPr>
+          <w:p>
+            <w:pPr>
+              <w:spacing w:after="0" w:before="0"/>
+            </w:pPr>
+            <w:r>
+              <w:rPr>
+                <w:color w:val="1A1A1A"/>
+                <w:sz w:val="18"/>
+                <w:szCs w:val="18"/>
+              </w:rPr>
+              <w:t xml:space="preserve">the distance from the back of the forks to the middle of the load; the truck's 1,600 kg is rated at 600 mm</w:t>
+            </w:r>
+          </w:p>
+        </w:tc>
+      </w:tr>
+      <w:tr>
+        <w:trPr>
+          <w:cantSplit/>
+          <w:tblHeader w:val="false"/>
+        </w:trPr>
+        <w:tc>
+          <w:tcPr>
+            <w:tcW w:type="dxa" w:w="3147"/>
+            <w:tcBorders>
+              <w:top w:val="single" w:color="D9D9D9" w:sz="4"/>
+              <w:left w:val="single" w:color="D9D9D9" w:sz="4"/>
+              <w:bottom w:val="single" w:color="D9D9D9" w:sz="4"/>
+              <w:right w:val="single" w:color="D9D9D9" w:sz="4"/>
+            </w:tcBorders>
+            <w:tcMar>
+              <w:top w:type="dxa" w:w="50"/>
+              <w:left w:type="dxa" w:w="90"/>
+              <w:bottom w:type="dxa" w:w="50"/>
+              <w:right w:type="dxa" w:w="90"/>
+            </w:tcMar>
+          </w:tcPr>
+          <w:p>
+            <w:pPr>
+              <w:spacing w:after="0" w:before="0"/>
+            </w:pPr>
+            <w:r>
+              <w:rPr>
+                <w:color w:val="1A1A1A"/>
+                <w:sz w:val="18"/>
+                <w:szCs w:val="18"/>
+              </w:rPr>
+              <w:t xml:space="preserve">Rack fill</w:t>
+            </w:r>
+          </w:p>
+        </w:tc>
+        <w:tc>
+          <w:tcPr>
+            <w:tcW w:type="dxa" w:w="6491"/>
+            <w:tcBorders>
+              <w:top w:val="single" w:color="D9D9D9" w:sz="4"/>
+              <w:left w:val="single" w:color="D9D9D9" w:sz="4"/>
+              <w:bottom w:val="single" w:color="D9D9D9" w:sz="4"/>
+              <w:right w:val="single" w:color="D9D9D9" w:sz="4"/>
+            </w:tcBorders>
+            <w:tcMar>
+              <w:top w:type="dxa" w:w="50"/>
+              <w:left w:type="dxa" w:w="90"/>
+              <w:bottom w:type="dxa" w:w="50"/>
+              <w:right w:type="dxa" w:w="90"/>
+            </w:tcMar>
+          </w:tcPr>
+          <w:p>
+            <w:pPr>
+              <w:spacing w:after="0" w:before="0"/>
+            </w:pPr>
+            <w:r>
+              <w:rPr>
+                <w:color w:val="1A1A1A"/>
+                <w:sz w:val="18"/>
+                <w:szCs w:val="18"/>
+              </w:rPr>
+              <w:t xml:space="preserve">the share of rack places in use</w:t>
+            </w:r>
+          </w:p>
+        </w:tc>
+      </w:tr>
+      <w:tr>
+        <w:trPr>
+          <w:cantSplit/>
+          <w:tblHeader w:val="false"/>
+        </w:trPr>
+        <w:tc>
+          <w:tcPr>
+            <w:tcW w:type="dxa" w:w="3147"/>
+            <w:tcBorders>
+              <w:top w:val="single" w:color="D9D9D9" w:sz="4"/>
+              <w:left w:val="single" w:color="D9D9D9" w:sz="4"/>
+              <w:bottom w:val="single" w:color="D9D9D9" w:sz="4"/>
+              <w:right w:val="single" w:color="D9D9D9" w:sz="4"/>
+            </w:tcBorders>
+            <w:tcMar>
+              <w:top w:type="dxa" w:w="50"/>
+              <w:left w:type="dxa" w:w="90"/>
+              <w:bottom w:type="dxa" w:w="50"/>
+              <w:right w:type="dxa" w:w="90"/>
+            </w:tcMar>
+          </w:tcPr>
+          <w:p>
+            <w:pPr>
+              <w:spacing w:after="0" w:before="0"/>
+            </w:pPr>
+            <w:r>
+              <w:rPr>
+                <w:color w:val="1A1A1A"/>
+                <w:sz w:val="18"/>
+                <w:szCs w:val="18"/>
+              </w:rPr>
+              <w:t xml:space="preserve">Headroom</w:t>
+            </w:r>
+          </w:p>
+        </w:tc>
+        <w:tc>
+          <w:tcPr>
+            <w:tcW w:type="dxa" w:w="6491"/>
+            <w:tcBorders>
+              <w:top w:val="single" w:color="D9D9D9" w:sz="4"/>
+              <w:left w:val="single" w:color="D9D9D9" w:sz="4"/>
+              <w:bottom w:val="single" w:color="D9D9D9" w:sz="4"/>
+              <w:right w:val="single" w:color="D9D9D9" w:sz="4"/>
+            </w:tcBorders>
+            <w:tcMar>
+              <w:top w:type="dxa" w:w="50"/>
+              <w:left w:type="dxa" w:w="90"/>
+              <w:bottom w:type="dxa" w:w="50"/>
+              <w:right w:type="dxa" w:w="90"/>
+            </w:tcMar>
+          </w:tcPr>
+          <w:p>
+            <w:pPr>
+              <w:spacing w:after="0" w:before="0"/>
+            </w:pPr>
+            <w:r>
+              <w:rPr>
+                <w:color w:val="1A1A1A"/>
+                <w:sz w:val="18"/>
+                <w:szCs w:val="18"/>
+              </w:rPr>
+              <w:t xml:space="preserve">how many months until the racks are full at the current growth</w:t>
+            </w:r>
+          </w:p>
+        </w:tc>
+      </w:tr>
+      <w:tr>
+        <w:trPr>
+          <w:cantSplit/>
+          <w:tblHeader w:val="false"/>
+        </w:trPr>
+        <w:tc>
+          <w:tcPr>
+            <w:tcW w:type="dxa" w:w="3147"/>
+            <w:tcBorders>
+              <w:top w:val="single" w:color="D9D9D9" w:sz="4"/>
+              <w:left w:val="single" w:color="D9D9D9" w:sz="4"/>
+              <w:bottom w:val="single" w:color="D9D9D9" w:sz="4"/>
+              <w:right w:val="single" w:color="D9D9D9" w:sz="4"/>
+            </w:tcBorders>
+            <w:tcMar>
+              <w:top w:type="dxa" w:w="50"/>
+              <w:left w:type="dxa" w:w="90"/>
+              <w:bottom w:type="dxa" w:w="50"/>
+              <w:right w:type="dxa" w:w="90"/>
+            </w:tcMar>
+          </w:tcPr>
+          <w:p>
+            <w:pPr>
+              <w:spacing w:after="0" w:before="0"/>
+            </w:pPr>
+            <w:r>
+              <w:rPr>
+                <w:color w:val="1A1A1A"/>
+                <w:sz w:val="18"/>
+                <w:szCs w:val="18"/>
+              </w:rPr>
+              <w:t xml:space="preserve">12th module</w:t>
+            </w:r>
+          </w:p>
+        </w:tc>
+        <w:tc>
+          <w:tcPr>
+            <w:tcW w:type="dxa" w:w="6491"/>
+            <w:tcBorders>
+              <w:top w:val="single" w:color="D9D9D9" w:sz="4"/>
+              <w:left w:val="single" w:color="D9D9D9" w:sz="4"/>
+              <w:bottom w:val="single" w:color="D9D9D9" w:sz="4"/>
+              <w:right w:val="single" w:color="D9D9D9" w:sz="4"/>
+            </w:tcBorders>
+            <w:tcMar>
+              <w:top w:type="dxa" w:w="50"/>
+              <w:left w:type="dxa" w:w="90"/>
+              <w:bottom w:type="dxa" w:w="50"/>
+              <w:right w:type="dxa" w:w="90"/>
+            </w:tcMar>
+          </w:tcPr>
+          <w:p>
+            <w:pPr>
+              <w:spacing w:after="0" w:before="0"/>
+            </w:pPr>
+            <w:r>
+              <w:rPr>
+                <w:color w:val="1A1A1A"/>
+                <w:sz w:val="18"/>
+                <w:szCs w:val="18"/>
+              </w:rPr>
+              <w:t xml:space="preserve">an extra block of racks (+864 places) kept in reserve for growth</w:t>
+            </w:r>
+          </w:p>
+        </w:tc>
+      </w:tr>
+      <w:tr>
+        <w:trPr>
+          <w:cantSplit/>
+          <w:tblHeader w:val="false"/>
+        </w:trPr>
+        <w:tc>
+          <w:tcPr>
+            <w:tcW w:type="dxa" w:w="3147"/>
+            <w:tcBorders>
+              <w:top w:val="single" w:color="D9D9D9" w:sz="4"/>
+              <w:left w:val="single" w:color="D9D9D9" w:sz="4"/>
+              <w:bottom w:val="single" w:color="D9D9D9" w:sz="4"/>
+              <w:right w:val="single" w:color="D9D9D9" w:sz="4"/>
+            </w:tcBorders>
+            <w:tcMar>
+              <w:top w:type="dxa" w:w="50"/>
+              <w:left w:type="dxa" w:w="90"/>
+              <w:bottom w:type="dxa" w:w="50"/>
+              <w:right w:type="dxa" w:w="90"/>
+            </w:tcMar>
+          </w:tcPr>
+          <w:p>
+            <w:pPr>
+              <w:spacing w:after="0" w:before="0"/>
+            </w:pPr>
+            <w:r>
+              <w:rPr>
+                <w:color w:val="1A1A1A"/>
+                <w:sz w:val="18"/>
+                <w:szCs w:val="18"/>
+              </w:rPr>
+              <w:t xml:space="preserve">Long-goods module</w:t>
+            </w:r>
+          </w:p>
+        </w:tc>
+        <w:tc>
+          <w:tcPr>
+            <w:tcW w:type="dxa" w:w="6491"/>
+            <w:tcBorders>
+              <w:top w:val="single" w:color="D9D9D9" w:sz="4"/>
+              <w:left w:val="single" w:color="D9D9D9" w:sz="4"/>
+              <w:bottom w:val="single" w:color="D9D9D9" w:sz="4"/>
+              <w:right w:val="single" w:color="D9D9D9" w:sz="4"/>
+            </w:tcBorders>
+            <w:tcMar>
+              <w:top w:type="dxa" w:w="50"/>
+              <w:left w:type="dxa" w:w="90"/>
+              <w:bottom w:type="dxa" w:w="50"/>
+              <w:right w:type="dxa" w:w="90"/>
+            </w:tcMar>
+          </w:tcPr>
+          <w:p>
+            <w:pPr>
+              <w:spacing w:after="0" w:before="0"/>
+            </w:pPr>
+            <w:r>
+              <w:rPr>
+                <w:color w:val="1A1A1A"/>
+                <w:sz w:val="18"/>
+                <w:szCs w:val="18"/>
+              </w:rPr>
+              <w:t xml:space="preserve">racks for long pallets (up to 2.05 m) with a 3.2 m aisle</w:t>
+            </w:r>
+          </w:p>
+        </w:tc>
+      </w:tr>
+      <w:tr>
+        <w:trPr>
+          <w:cantSplit/>
+          <w:tblHeader w:val="false"/>
+        </w:trPr>
+        <w:tc>
+          <w:tcPr>
+            <w:tcW w:type="dxa" w:w="3147"/>
+            <w:tcBorders>
+              <w:top w:val="single" w:color="D9D9D9" w:sz="4"/>
+              <w:left w:val="single" w:color="D9D9D9" w:sz="4"/>
+              <w:bottom w:val="single" w:color="D9D9D9" w:sz="4"/>
+              <w:right w:val="single" w:color="D9D9D9" w:sz="4"/>
+            </w:tcBorders>
+            <w:tcMar>
+              <w:top w:type="dxa" w:w="50"/>
+              <w:left w:type="dxa" w:w="90"/>
+              <w:bottom w:type="dxa" w:w="50"/>
+              <w:right w:type="dxa" w:w="90"/>
+            </w:tcMar>
+          </w:tcPr>
+          <w:p>
+            <w:pPr>
+              <w:spacing w:after="0" w:before="0"/>
+            </w:pPr>
+            <w:r>
+              <w:rPr>
+                <w:color w:val="1A1A1A"/>
+                <w:sz w:val="18"/>
+                <w:szCs w:val="18"/>
+              </w:rPr>
+              <w:t xml:space="preserve">Dead stock</w:t>
+            </w:r>
+          </w:p>
+        </w:tc>
+        <w:tc>
+          <w:tcPr>
+            <w:tcW w:type="dxa" w:w="6491"/>
+            <w:tcBorders>
+              <w:top w:val="single" w:color="D9D9D9" w:sz="4"/>
+              <w:left w:val="single" w:color="D9D9D9" w:sz="4"/>
+              <w:bottom w:val="single" w:color="D9D9D9" w:sz="4"/>
+              <w:right w:val="single" w:color="D9D9D9" w:sz="4"/>
+            </w:tcBorders>
+            <w:tcMar>
+              <w:top w:type="dxa" w:w="50"/>
+              <w:left w:type="dxa" w:w="90"/>
+              <w:bottom w:type="dxa" w:w="50"/>
+              <w:right w:type="dxa" w:w="90"/>
+            </w:tcMar>
+          </w:tcPr>
+          <w:p>
+            <w:pPr>
+              <w:spacing w:after="0" w:before="0"/>
+            </w:pPr>
+            <w:r>
+              <w:rPr>
+                <w:color w:val="1A1A1A"/>
+                <w:sz w:val="18"/>
+                <w:szCs w:val="18"/>
+              </w:rPr>
+              <w:t xml:space="preserve">stock that has not moved for a long time (21% of loads are over a year old)</w:t>
+            </w:r>
+          </w:p>
+        </w:tc>
+      </w:tr>
+      <w:tr>
+        <w:trPr>
+          <w:cantSplit/>
+          <w:tblHeader w:val="false"/>
+        </w:trPr>
+        <w:tc>
+          <w:tcPr>
+            <w:tcW w:type="dxa" w:w="3147"/>
+            <w:tcBorders>
+              <w:top w:val="single" w:color="D9D9D9" w:sz="4"/>
+              <w:left w:val="single" w:color="D9D9D9" w:sz="4"/>
+              <w:bottom w:val="single" w:color="D9D9D9" w:sz="4"/>
+              <w:right w:val="single" w:color="D9D9D9" w:sz="4"/>
+            </w:tcBorders>
+            <w:tcMar>
+              <w:top w:type="dxa" w:w="50"/>
+              <w:left w:type="dxa" w:w="90"/>
+              <w:bottom w:type="dxa" w:w="50"/>
+              <w:right w:type="dxa" w:w="90"/>
+            </w:tcMar>
+          </w:tcPr>
+          <w:p>
+            <w:pPr>
+              <w:spacing w:after="0" w:before="0"/>
+            </w:pPr>
+            <w:r>
+              <w:rPr>
+                <w:color w:val="1A1A1A"/>
+                <w:sz w:val="18"/>
+                <w:szCs w:val="18"/>
+              </w:rPr>
+              <w:t xml:space="preserve">Bin shelving</w:t>
+            </w:r>
+          </w:p>
+        </w:tc>
+        <w:tc>
+          <w:tcPr>
+            <w:tcW w:type="dxa" w:w="6491"/>
+            <w:tcBorders>
+              <w:top w:val="single" w:color="D9D9D9" w:sz="4"/>
+              <w:left w:val="single" w:color="D9D9D9" w:sz="4"/>
+              <w:bottom w:val="single" w:color="D9D9D9" w:sz="4"/>
+              <w:right w:val="single" w:color="D9D9D9" w:sz="4"/>
+            </w:tcBorders>
+            <w:tcMar>
+              <w:top w:type="dxa" w:w="50"/>
+              <w:left w:type="dxa" w:w="90"/>
+              <w:bottom w:type="dxa" w:w="50"/>
+              <w:right w:type="dxa" w:w="90"/>
+            </w:tcMar>
+          </w:tcPr>
+          <w:p>
+            <w:pPr>
+              <w:spacing w:after="0" w:before="0"/>
+            </w:pPr>
+            <w:r>
+              <w:rPr>
+                <w:color w:val="1A1A1A"/>
+                <w:sz w:val="18"/>
+                <w:szCs w:val="18"/>
+              </w:rPr>
+              <w:t xml:space="preserve">low shelves with plastic bins for small parts, picked by hand</w:t>
+            </w:r>
+          </w:p>
+        </w:tc>
+      </w:tr>
+      <w:tr>
+        <w:trPr>
+          <w:cantSplit/>
+          <w:tblHeader w:val="false"/>
+        </w:trPr>
+        <w:tc>
+          <w:tcPr>
+            <w:tcW w:type="dxa" w:w="3147"/>
+            <w:tcBorders>
+              <w:top w:val="single" w:color="D9D9D9" w:sz="4"/>
+              <w:left w:val="single" w:color="D9D9D9" w:sz="4"/>
+              <w:bottom w:val="single" w:color="D9D9D9" w:sz="4"/>
+              <w:right w:val="single" w:color="D9D9D9" w:sz="4"/>
+            </w:tcBorders>
+            <w:tcMar>
+              <w:top w:type="dxa" w:w="50"/>
+              <w:left w:type="dxa" w:w="90"/>
+              <w:bottom w:type="dxa" w:w="50"/>
+              <w:right w:type="dxa" w:w="90"/>
+            </w:tcMar>
+          </w:tcPr>
+          <w:p>
+            <w:pPr>
+              <w:spacing w:after="0" w:before="0"/>
+            </w:pPr>
+            <w:r>
+              <w:rPr>
+                <w:color w:val="1A1A1A"/>
+                <w:sz w:val="18"/>
+                <w:szCs w:val="18"/>
+              </w:rPr>
+              <w:t xml:space="preserve">Kardex lift</w:t>
+            </w:r>
+          </w:p>
+        </w:tc>
+        <w:tc>
+          <w:tcPr>
+            <w:tcW w:type="dxa" w:w="6491"/>
+            <w:tcBorders>
+              <w:top w:val="single" w:color="D9D9D9" w:sz="4"/>
+              <w:left w:val="single" w:color="D9D9D9" w:sz="4"/>
+              <w:bottom w:val="single" w:color="D9D9D9" w:sz="4"/>
+              <w:right w:val="single" w:color="D9D9D9" w:sz="4"/>
+            </w:tcBorders>
+            <w:tcMar>
+              <w:top w:type="dxa" w:w="50"/>
+              <w:left w:type="dxa" w:w="90"/>
+              <w:bottom w:type="dxa" w:w="50"/>
+              <w:right w:type="dxa" w:w="90"/>
+            </w:tcMar>
+          </w:tcPr>
+          <w:p>
+            <w:pPr>
+              <w:spacing w:after="0" w:before="0"/>
+            </w:pPr>
+            <w:r>
+              <w:rPr>
+                <w:color w:val="1A1A1A"/>
+                <w:sz w:val="18"/>
+                <w:szCs w:val="18"/>
+              </w:rPr>
+              <w:t xml:space="preserve">an automatic vertical storage lift for small parts; compared, not chosen</w:t>
+            </w:r>
+          </w:p>
+        </w:tc>
+      </w:tr>
+      <w:tr>
+        <w:trPr>
+          <w:cantSplit/>
+          <w:tblHeader w:val="false"/>
+        </w:trPr>
+        <w:tc>
+          <w:tcPr>
+            <w:tcW w:type="dxa" w:w="3147"/>
+            <w:tcBorders>
+              <w:top w:val="single" w:color="D9D9D9" w:sz="4"/>
+              <w:left w:val="single" w:color="D9D9D9" w:sz="4"/>
+              <w:bottom w:val="single" w:color="D9D9D9" w:sz="4"/>
+              <w:right w:val="single" w:color="D9D9D9" w:sz="4"/>
+            </w:tcBorders>
+            <w:tcMar>
+              <w:top w:type="dxa" w:w="50"/>
+              <w:left w:type="dxa" w:w="90"/>
+              <w:bottom w:type="dxa" w:w="50"/>
+              <w:right w:type="dxa" w:w="90"/>
+            </w:tcMar>
+          </w:tcPr>
+          <w:p>
+            <w:pPr>
+              <w:spacing w:after="0" w:before="0"/>
+            </w:pPr>
+            <w:r>
+              <w:rPr>
+                <w:color w:val="1A1A1A"/>
+                <w:sz w:val="18"/>
+                <w:szCs w:val="18"/>
+              </w:rPr>
+              <w:t xml:space="preserve">COI (cube-per-order index)</w:t>
+            </w:r>
+          </w:p>
+        </w:tc>
+        <w:tc>
+          <w:tcPr>
+            <w:tcW w:type="dxa" w:w="6491"/>
+            <w:tcBorders>
+              <w:top w:val="single" w:color="D9D9D9" w:sz="4"/>
+              <w:left w:val="single" w:color="D9D9D9" w:sz="4"/>
+              <w:bottom w:val="single" w:color="D9D9D9" w:sz="4"/>
+              <w:right w:val="single" w:color="D9D9D9" w:sz="4"/>
+            </w:tcBorders>
+            <w:tcMar>
+              <w:top w:type="dxa" w:w="50"/>
+              <w:left w:type="dxa" w:w="90"/>
+              <w:bottom w:type="dxa" w:w="50"/>
+              <w:right w:type="dxa" w:w="90"/>
+            </w:tcMar>
+          </w:tcPr>
+          <w:p>
+            <w:pPr>
+              <w:spacing w:after="0" w:before="0"/>
+            </w:pPr>
+            <w:r>
+              <w:rPr>
+                <w:color w:val="1A1A1A"/>
+                <w:sz w:val="18"/>
+                <w:szCs w:val="18"/>
+              </w:rPr>
+              <w:t xml:space="preserve">the space an item needs ÷ how often it is picked; a low COI means: put it closest to packing</w:t>
+            </w:r>
+          </w:p>
+        </w:tc>
+      </w:tr>
+      <w:tr>
+        <w:trPr>
+          <w:cantSplit/>
+          <w:tblHeader w:val="false"/>
+        </w:trPr>
+        <w:tc>
+          <w:tcPr>
+            <w:tcW w:type="dxa" w:w="3147"/>
+            <w:tcBorders>
+              <w:top w:val="single" w:color="D9D9D9" w:sz="4"/>
+              <w:left w:val="single" w:color="D9D9D9" w:sz="4"/>
+              <w:bottom w:val="single" w:color="D9D9D9" w:sz="4"/>
+              <w:right w:val="single" w:color="D9D9D9" w:sz="4"/>
+            </w:tcBorders>
+            <w:tcMar>
+              <w:top w:type="dxa" w:w="50"/>
+              <w:left w:type="dxa" w:w="90"/>
+              <w:bottom w:type="dxa" w:w="50"/>
+              <w:right w:type="dxa" w:w="90"/>
+            </w:tcMar>
+          </w:tcPr>
+          <w:p>
+            <w:pPr>
+              <w:spacing w:after="0" w:before="0"/>
+            </w:pPr>
+            <w:r>
+              <w:rPr>
+                <w:color w:val="1A1A1A"/>
+                <w:sz w:val="18"/>
+                <w:szCs w:val="18"/>
+              </w:rPr>
+              <w:t xml:space="preserve">FIFO</w:t>
+            </w:r>
+          </w:p>
+        </w:tc>
+        <w:tc>
+          <w:tcPr>
+            <w:tcW w:type="dxa" w:w="6491"/>
+            <w:tcBorders>
+              <w:top w:val="single" w:color="D9D9D9" w:sz="4"/>
+              <w:left w:val="single" w:color="D9D9D9" w:sz="4"/>
+              <w:bottom w:val="single" w:color="D9D9D9" w:sz="4"/>
+              <w:right w:val="single" w:color="D9D9D9" w:sz="4"/>
+            </w:tcBorders>
+            <w:tcMar>
+              <w:top w:type="dxa" w:w="50"/>
+              <w:left w:type="dxa" w:w="90"/>
+              <w:bottom w:type="dxa" w:w="50"/>
+              <w:right w:type="dxa" w:w="90"/>
+            </w:tcMar>
+          </w:tcPr>
+          <w:p>
+            <w:pPr>
+              <w:spacing w:after="0" w:before="0"/>
+            </w:pPr>
+            <w:r>
+              <w:rPr>
+                <w:color w:val="1A1A1A"/>
+                <w:sz w:val="18"/>
+                <w:szCs w:val="18"/>
+              </w:rPr>
+              <w:t xml:space="preserve">first in, first out: the oldest stock is used first</w:t>
+            </w:r>
+          </w:p>
+        </w:tc>
+      </w:tr>
+      <w:tr>
+        <w:trPr>
+          <w:cantSplit/>
+          <w:tblHeader w:val="false"/>
+        </w:trPr>
+        <w:tc>
+          <w:tcPr>
+            <w:tcW w:type="dxa" w:w="3147"/>
+            <w:tcBorders>
+              <w:top w:val="single" w:color="D9D9D9" w:sz="4"/>
+              <w:left w:val="single" w:color="D9D9D9" w:sz="4"/>
+              <w:bottom w:val="single" w:color="D9D9D9" w:sz="4"/>
+              <w:right w:val="single" w:color="D9D9D9" w:sz="4"/>
+            </w:tcBorders>
+            <w:tcMar>
+              <w:top w:type="dxa" w:w="50"/>
+              <w:left w:type="dxa" w:w="90"/>
+              <w:bottom w:type="dxa" w:w="50"/>
+              <w:right w:type="dxa" w:w="90"/>
+            </w:tcMar>
+          </w:tcPr>
+          <w:p>
+            <w:pPr>
+              <w:spacing w:after="0" w:before="0"/>
+            </w:pPr>
+            <w:r>
+              <w:rPr>
+                <w:color w:val="1A1A1A"/>
+                <w:sz w:val="18"/>
+                <w:szCs w:val="18"/>
+              </w:rPr>
+              <w:t xml:space="preserve">Min/max refill</w:t>
+            </w:r>
+          </w:p>
+        </w:tc>
+        <w:tc>
+          <w:tcPr>
+            <w:tcW w:type="dxa" w:w="6491"/>
+            <w:tcBorders>
+              <w:top w:val="single" w:color="D9D9D9" w:sz="4"/>
+              <w:left w:val="single" w:color="D9D9D9" w:sz="4"/>
+              <w:bottom w:val="single" w:color="D9D9D9" w:sz="4"/>
+              <w:right w:val="single" w:color="D9D9D9" w:sz="4"/>
+            </w:tcBorders>
+            <w:tcMar>
+              <w:top w:type="dxa" w:w="50"/>
+              <w:left w:type="dxa" w:w="90"/>
+              <w:bottom w:type="dxa" w:w="50"/>
+              <w:right w:type="dxa" w:w="90"/>
+            </w:tcMar>
+          </w:tcPr>
+          <w:p>
+            <w:pPr>
+              <w:spacing w:after="0" w:before="0"/>
+            </w:pPr>
+            <w:r>
+              <w:rPr>
+                <w:color w:val="1A1A1A"/>
+                <w:sz w:val="18"/>
+                <w:szCs w:val="18"/>
+              </w:rPr>
+              <w:t xml:space="preserve">a pick face is refilled when it drops below a minimum, up to a maximum</w:t>
+            </w:r>
+          </w:p>
+        </w:tc>
+      </w:tr>
+      <w:tr>
+        <w:trPr>
+          <w:cantSplit/>
+          <w:tblHeader w:val="false"/>
+        </w:trPr>
+        <w:tc>
+          <w:tcPr>
+            <w:tcW w:type="dxa" w:w="3147"/>
+            <w:tcBorders>
+              <w:top w:val="single" w:color="D9D9D9" w:sz="4"/>
+              <w:left w:val="single" w:color="D9D9D9" w:sz="4"/>
+              <w:bottom w:val="single" w:color="D9D9D9" w:sz="4"/>
+              <w:right w:val="single" w:color="D9D9D9" w:sz="4"/>
+            </w:tcBorders>
+            <w:tcMar>
+              <w:top w:type="dxa" w:w="50"/>
+              <w:left w:type="dxa" w:w="90"/>
+              <w:bottom w:type="dxa" w:w="50"/>
+              <w:right w:type="dxa" w:w="90"/>
+            </w:tcMar>
+          </w:tcPr>
+          <w:p>
+            <w:pPr>
+              <w:spacing w:after="0" w:before="0"/>
+            </w:pPr>
+            <w:r>
+              <w:rPr>
+                <w:color w:val="1A1A1A"/>
+                <w:sz w:val="18"/>
+                <w:szCs w:val="18"/>
+              </w:rPr>
+              <w:t xml:space="preserve">Cycle count</w:t>
+            </w:r>
+          </w:p>
+        </w:tc>
+        <w:tc>
+          <w:tcPr>
+            <w:tcW w:type="dxa" w:w="6491"/>
+            <w:tcBorders>
+              <w:top w:val="single" w:color="D9D9D9" w:sz="4"/>
+              <w:left w:val="single" w:color="D9D9D9" w:sz="4"/>
+              <w:bottom w:val="single" w:color="D9D9D9" w:sz="4"/>
+              <w:right w:val="single" w:color="D9D9D9" w:sz="4"/>
+            </w:tcBorders>
+            <w:tcMar>
+              <w:top w:type="dxa" w:w="50"/>
+              <w:left w:type="dxa" w:w="90"/>
+              <w:bottom w:type="dxa" w:w="50"/>
+              <w:right w:type="dxa" w:w="90"/>
+            </w:tcMar>
+          </w:tcPr>
+          <w:p>
+            <w:pPr>
+              <w:spacing w:after="0" w:before="0"/>
+            </w:pPr>
+            <w:r>
+              <w:rPr>
+                <w:color w:val="1A1A1A"/>
+                <w:sz w:val="18"/>
+                <w:szCs w:val="18"/>
+              </w:rPr>
+              <w:t xml:space="preserve">counting part of the stock regularly instead of everything at once (A items monthly, B quarterly, C yearly)</w:t>
+            </w:r>
+          </w:p>
+        </w:tc>
+      </w:tr>
+      <w:tr>
+        <w:trPr>
+          <w:cantSplit/>
+          <w:tblHeader w:val="false"/>
+        </w:trPr>
+        <w:tc>
+          <w:tcPr>
+            <w:tcW w:type="dxa" w:w="3147"/>
+            <w:tcBorders>
+              <w:top w:val="single" w:color="D9D9D9" w:sz="4"/>
+              <w:left w:val="single" w:color="D9D9D9" w:sz="4"/>
+              <w:bottom w:val="single" w:color="D9D9D9" w:sz="4"/>
+              <w:right w:val="single" w:color="D9D9D9" w:sz="4"/>
+            </w:tcBorders>
+            <w:tcMar>
+              <w:top w:type="dxa" w:w="50"/>
+              <w:left w:type="dxa" w:w="90"/>
+              <w:bottom w:type="dxa" w:w="50"/>
+              <w:right w:type="dxa" w:w="90"/>
+            </w:tcMar>
+          </w:tcPr>
+          <w:p>
+            <w:pPr>
+              <w:spacing w:after="0" w:before="0"/>
+            </w:pPr>
+            <w:r>
+              <w:rPr>
+                <w:color w:val="1A1A1A"/>
+                <w:sz w:val="18"/>
+                <w:szCs w:val="18"/>
+              </w:rPr>
+              <w:t xml:space="preserve">EN 15512 / EN 15635</w:t>
+            </w:r>
+          </w:p>
+        </w:tc>
+        <w:tc>
+          <w:tcPr>
+            <w:tcW w:type="dxa" w:w="6491"/>
+            <w:tcBorders>
+              <w:top w:val="single" w:color="D9D9D9" w:sz="4"/>
+              <w:left w:val="single" w:color="D9D9D9" w:sz="4"/>
+              <w:bottom w:val="single" w:color="D9D9D9" w:sz="4"/>
+              <w:right w:val="single" w:color="D9D9D9" w:sz="4"/>
+            </w:tcBorders>
+            <w:tcMar>
+              <w:top w:type="dxa" w:w="50"/>
+              <w:left w:type="dxa" w:w="90"/>
+              <w:bottom w:type="dxa" w:w="50"/>
+              <w:right w:type="dxa" w:w="90"/>
+            </w:tcMar>
+          </w:tcPr>
+          <w:p>
+            <w:pPr>
+              <w:spacing w:after="0" w:before="0"/>
+            </w:pPr>
+            <w:r>
+              <w:rPr>
+                <w:color w:val="1A1A1A"/>
+                <w:sz w:val="18"/>
+                <w:szCs w:val="18"/>
+              </w:rPr>
+              <w:t xml:space="preserve">European standards for designing racks / for using and inspecting them (inspection every year)</w:t>
+            </w:r>
+          </w:p>
+        </w:tc>
+      </w:tr>
+      <w:tr>
+        <w:trPr>
+          <w:cantSplit/>
+          <w:tblHeader w:val="false"/>
+        </w:trPr>
+        <w:tc>
+          <w:tcPr>
+            <w:tcW w:type="dxa" w:w="3147"/>
+            <w:tcBorders>
+              <w:top w:val="single" w:color="D9D9D9" w:sz="4"/>
+              <w:left w:val="single" w:color="D9D9D9" w:sz="4"/>
+              <w:bottom w:val="single" w:color="D9D9D9" w:sz="4"/>
+              <w:right w:val="single" w:color="D9D9D9" w:sz="4"/>
+            </w:tcBorders>
+            <w:tcMar>
+              <w:top w:type="dxa" w:w="50"/>
+              <w:left w:type="dxa" w:w="90"/>
+              <w:bottom w:type="dxa" w:w="50"/>
+              <w:right w:type="dxa" w:w="90"/>
+            </w:tcMar>
+          </w:tcPr>
+          <w:p>
+            <w:pPr>
+              <w:spacing w:after="0" w:before="0"/>
+            </w:pPr>
+            <w:r>
+              <w:rPr>
+                <w:color w:val="1A1A1A"/>
+                <w:sz w:val="18"/>
+                <w:szCs w:val="18"/>
+              </w:rPr>
+              <w:t xml:space="preserve">PGS 15 / PGS 37-2</w:t>
+            </w:r>
+          </w:p>
+        </w:tc>
+        <w:tc>
+          <w:tcPr>
+            <w:tcW w:type="dxa" w:w="6491"/>
+            <w:tcBorders>
+              <w:top w:val="single" w:color="D9D9D9" w:sz="4"/>
+              <w:left w:val="single" w:color="D9D9D9" w:sz="4"/>
+              <w:bottom w:val="single" w:color="D9D9D9" w:sz="4"/>
+              <w:right w:val="single" w:color="D9D9D9" w:sz="4"/>
+            </w:tcBorders>
+            <w:tcMar>
+              <w:top w:type="dxa" w:w="50"/>
+              <w:left w:type="dxa" w:w="90"/>
+              <w:bottom w:type="dxa" w:w="50"/>
+              <w:right w:type="dxa" w:w="90"/>
+            </w:tcMar>
+          </w:tcPr>
+          <w:p>
+            <w:pPr>
+              <w:spacing w:after="0" w:before="0"/>
+            </w:pPr>
+            <w:r>
+              <w:rPr>
+                <w:color w:val="1A1A1A"/>
+                <w:sz w:val="18"/>
+                <w:szCs w:val="18"/>
+              </w:rPr>
+              <w:t xml:space="preserve">Dutch guidelines for storing hazardous goods / lithium batteries</w:t>
+            </w:r>
+          </w:p>
+        </w:tc>
+      </w:tr>
+    </w:tbl>
+    <w:p>
+      <w:pPr>
+        <w:spacing w:after="80" w:before="0"/>
+      </w:pPr>
+    </w:p>
+    <w:p>
+      <w:pPr>
+        <w:pStyle w:val="Heading2"/>
+        <w:keepNext/>
+        <w:spacing w:after="80" w:before="220"/>
+      </w:pPr>
+      <w:r>
+        <w:rPr>
+          <w:b/>
+          <w:bCs/>
+          <w:color w:val="D40511"/>
+          <w:sz w:val="23"/>
+          <w:szCs w:val="23"/>
+        </w:rPr>
+        <w:t xml:space="preserve">General words (the same in all four briefings)</w:t>
+      </w:r>
+    </w:p>
+    <w:tbl>
+      <w:tblPr>
+        <w:tblW w:type="dxa" w:w="9638"/>
+        <w:tblBorders>
+          <w:top w:val="single" w:color="auto" w:sz="4"/>
+          <w:left w:val="single" w:color="auto" w:sz="4"/>
+          <w:bottom w:val="single" w:color="auto" w:sz="4"/>
+          <w:right w:val="single" w:color="auto" w:sz="4"/>
+          <w:insideH w:val="single" w:color="auto" w:sz="4"/>
+          <w:insideV w:val="single" w:color="auto" w:sz="4"/>
+        </w:tblBorders>
+        <w:tblLayout w:type="fixed"/>
+      </w:tblPr>
+      <w:tblGrid>
+        <w:gridCol w:w="4549"/>
+        <w:gridCol w:w="5089"/>
+      </w:tblGrid>
+      <w:tr>
+        <w:trPr>
+          <w:cantSplit/>
+          <w:tblHeader/>
+        </w:trPr>
+        <w:tc>
+          <w:tcPr>
+            <w:tcW w:type="dxa" w:w="4549"/>
+            <w:tcBorders>
+              <w:top w:val="single" w:color="D9D9D9" w:sz="4"/>
+              <w:left w:val="single" w:color="D9D9D9" w:sz="4"/>
+              <w:bottom w:val="single" w:color="D9D9D9" w:sz="4"/>
+              <w:right w:val="single" w:color="D9D9D9" w:sz="4"/>
+            </w:tcBorders>
+            <w:shd w:fill="F2F2F2" w:color="auto" w:val="clear"/>
+            <w:tcMar>
+              <w:top w:type="dxa" w:w="50"/>
+              <w:left w:type="dxa" w:w="90"/>
+              <w:bottom w:type="dxa" w:w="50"/>
+              <w:right w:type="dxa" w:w="90"/>
+            </w:tcMar>
+          </w:tcPr>
+          <w:p>
+            <w:pPr>
+              <w:spacing w:after="0" w:before="0"/>
+            </w:pPr>
+            <w:r>
+              <w:rPr>
+                <w:b/>
+                <w:bCs/>
+                <w:color w:val="595959"/>
+                <w:sz w:val="18"/>
+                <w:szCs w:val="18"/>
+              </w:rPr>
+              <w:t xml:space="preserve">Word</w:t>
+            </w:r>
+          </w:p>
+        </w:tc>
+        <w:tc>
+          <w:tcPr>
+            <w:tcW w:type="dxa" w:w="5089"/>
+            <w:tcBorders>
+              <w:top w:val="single" w:color="D9D9D9" w:sz="4"/>
+              <w:left w:val="single" w:color="D9D9D9" w:sz="4"/>
+              <w:bottom w:val="single" w:color="D9D9D9" w:sz="4"/>
+              <w:right w:val="single" w:color="D9D9D9" w:sz="4"/>
+            </w:tcBorders>
+            <w:shd w:fill="F2F2F2" w:color="auto" w:val="clear"/>
+            <w:tcMar>
+              <w:top w:type="dxa" w:w="50"/>
+              <w:left w:type="dxa" w:w="90"/>
+              <w:bottom w:type="dxa" w:w="50"/>
+              <w:right w:type="dxa" w:w="90"/>
+            </w:tcMar>
+          </w:tcPr>
+          <w:p>
+            <w:pPr>
+              <w:spacing w:after="0" w:before="0"/>
+            </w:pPr>
+            <w:r>
+              <w:rPr>
+                <w:b/>
+                <w:bCs/>
+                <w:color w:val="595959"/>
+                <w:sz w:val="18"/>
+                <w:szCs w:val="18"/>
+              </w:rPr>
+              <w:t xml:space="preserve">What it means</w:t>
+            </w:r>
+          </w:p>
+        </w:tc>
+      </w:tr>
+      <w:tr>
+        <w:trPr>
+          <w:cantSplit/>
+          <w:tblHeader w:val="false"/>
+        </w:trPr>
+        <w:tc>
+          <w:tcPr>
+            <w:tcW w:type="dxa" w:w="4549"/>
+            <w:tcBorders>
+              <w:top w:val="single" w:color="D9D9D9" w:sz="4"/>
+              <w:left w:val="single" w:color="D9D9D9" w:sz="4"/>
+              <w:bottom w:val="single" w:color="D9D9D9" w:sz="4"/>
+              <w:right w:val="single" w:color="D9D9D9" w:sz="4"/>
+            </w:tcBorders>
+            <w:tcMar>
+              <w:top w:type="dxa" w:w="50"/>
+              <w:left w:type="dxa" w:w="90"/>
+              <w:bottom w:type="dxa" w:w="50"/>
+              <w:right w:type="dxa" w:w="90"/>
+            </w:tcMar>
+          </w:tcPr>
+          <w:p>
+            <w:pPr>
+              <w:spacing w:after="0" w:before="0"/>
+            </w:pPr>
+            <w:r>
+              <w:rPr>
+                <w:color w:val="1A1A1A"/>
+                <w:sz w:val="18"/>
+                <w:szCs w:val="18"/>
+              </w:rPr>
+              <w:t xml:space="preserve">WMS</w:t>
+            </w:r>
+          </w:p>
+        </w:tc>
+        <w:tc>
+          <w:tcPr>
+            <w:tcW w:type="dxa" w:w="5089"/>
+            <w:tcBorders>
+              <w:top w:val="single" w:color="D9D9D9" w:sz="4"/>
+              <w:left w:val="single" w:color="D9D9D9" w:sz="4"/>
+              <w:bottom w:val="single" w:color="D9D9D9" w:sz="4"/>
+              <w:right w:val="single" w:color="D9D9D9" w:sz="4"/>
+            </w:tcBorders>
+            <w:tcMar>
+              <w:top w:type="dxa" w:w="50"/>
+              <w:left w:type="dxa" w:w="90"/>
+              <w:bottom w:type="dxa" w:w="50"/>
+              <w:right w:type="dxa" w:w="90"/>
+            </w:tcMar>
+          </w:tcPr>
+          <w:p>
+            <w:pPr>
+              <w:spacing w:after="0" w:before="0"/>
+            </w:pPr>
+            <w:r>
+              <w:rPr>
+                <w:color w:val="1A1A1A"/>
+                <w:sz w:val="18"/>
+                <w:szCs w:val="18"/>
+              </w:rPr>
+              <w:t xml:space="preserve">the warehouse management system: the computer system that knows where every pallet is and tells people what to do. Almost all our data comes from it</w:t>
+            </w:r>
+          </w:p>
+        </w:tc>
+      </w:tr>
+      <w:tr>
+        <w:trPr>
+          <w:cantSplit/>
+          <w:tblHeader w:val="false"/>
+        </w:trPr>
+        <w:tc>
+          <w:tcPr>
+            <w:tcW w:type="dxa" w:w="4549"/>
+            <w:tcBorders>
+              <w:top w:val="single" w:color="D9D9D9" w:sz="4"/>
+              <w:left w:val="single" w:color="D9D9D9" w:sz="4"/>
+              <w:bottom w:val="single" w:color="D9D9D9" w:sz="4"/>
+              <w:right w:val="single" w:color="D9D9D9" w:sz="4"/>
+            </w:tcBorders>
+            <w:tcMar>
+              <w:top w:type="dxa" w:w="50"/>
+              <w:left w:type="dxa" w:w="90"/>
+              <w:bottom w:type="dxa" w:w="50"/>
+              <w:right w:type="dxa" w:w="90"/>
+            </w:tcMar>
+          </w:tcPr>
+          <w:p>
+            <w:pPr>
+              <w:spacing w:after="0" w:before="0"/>
+            </w:pPr>
+            <w:r>
+              <w:rPr>
+                <w:color w:val="1A1A1A"/>
+                <w:sz w:val="18"/>
+                <w:szCs w:val="18"/>
+              </w:rPr>
+              <w:t xml:space="preserve">Item (SKU)</w:t>
+            </w:r>
+          </w:p>
+        </w:tc>
+        <w:tc>
+          <w:tcPr>
+            <w:tcW w:type="dxa" w:w="5089"/>
+            <w:tcBorders>
+              <w:top w:val="single" w:color="D9D9D9" w:sz="4"/>
+              <w:left w:val="single" w:color="D9D9D9" w:sz="4"/>
+              <w:bottom w:val="single" w:color="D9D9D9" w:sz="4"/>
+              <w:right w:val="single" w:color="D9D9D9" w:sz="4"/>
+            </w:tcBorders>
+            <w:tcMar>
+              <w:top w:type="dxa" w:w="50"/>
+              <w:left w:type="dxa" w:w="90"/>
+              <w:bottom w:type="dxa" w:w="50"/>
+              <w:right w:type="dxa" w:w="90"/>
+            </w:tcMar>
+          </w:tcPr>
+          <w:p>
+            <w:pPr>
+              <w:spacing w:after="0" w:before="0"/>
+            </w:pPr>
+            <w:r>
+              <w:rPr>
+                <w:color w:val="1A1A1A"/>
+                <w:sz w:val="18"/>
+                <w:szCs w:val="18"/>
+              </w:rPr>
+              <w:t xml:space="preserve">one specific product, e.g. one type of lock. There are 5,291 in stock</w:t>
+            </w:r>
+          </w:p>
+        </w:tc>
+      </w:tr>
+      <w:tr>
+        <w:trPr>
+          <w:cantSplit/>
+          <w:tblHeader w:val="false"/>
+        </w:trPr>
+        <w:tc>
+          <w:tcPr>
+            <w:tcW w:type="dxa" w:w="4549"/>
+            <w:tcBorders>
+              <w:top w:val="single" w:color="D9D9D9" w:sz="4"/>
+              <w:left w:val="single" w:color="D9D9D9" w:sz="4"/>
+              <w:bottom w:val="single" w:color="D9D9D9" w:sz="4"/>
+              <w:right w:val="single" w:color="D9D9D9" w:sz="4"/>
+            </w:tcBorders>
+            <w:tcMar>
+              <w:top w:type="dxa" w:w="50"/>
+              <w:left w:type="dxa" w:w="90"/>
+              <w:bottom w:type="dxa" w:w="50"/>
+              <w:right w:type="dxa" w:w="90"/>
+            </w:tcMar>
+          </w:tcPr>
+          <w:p>
+            <w:pPr>
+              <w:spacing w:after="0" w:before="0"/>
+            </w:pPr>
+            <w:r>
+              <w:rPr>
+                <w:color w:val="1A1A1A"/>
+                <w:sz w:val="18"/>
+                <w:szCs w:val="18"/>
+              </w:rPr>
+              <w:t xml:space="preserve">Load</w:t>
+            </w:r>
+          </w:p>
+        </w:tc>
+        <w:tc>
+          <w:tcPr>
+            <w:tcW w:type="dxa" w:w="5089"/>
+            <w:tcBorders>
+              <w:top w:val="single" w:color="D9D9D9" w:sz="4"/>
+              <w:left w:val="single" w:color="D9D9D9" w:sz="4"/>
+              <w:bottom w:val="single" w:color="D9D9D9" w:sz="4"/>
+              <w:right w:val="single" w:color="D9D9D9" w:sz="4"/>
+            </w:tcBorders>
+            <w:tcMar>
+              <w:top w:type="dxa" w:w="50"/>
+              <w:left w:type="dxa" w:w="90"/>
+              <w:bottom w:type="dxa" w:w="50"/>
+              <w:right w:type="dxa" w:w="90"/>
+            </w:tcMar>
+          </w:tcPr>
+          <w:p>
+            <w:pPr>
+              <w:spacing w:after="0" w:before="0"/>
+            </w:pPr>
+            <w:r>
+              <w:rPr>
+                <w:color w:val="1A1A1A"/>
+                <w:sz w:val="18"/>
+                <w:szCs w:val="18"/>
+              </w:rPr>
+              <w:t xml:space="preserve">one pallet (or other carrier) of stock with its own number in the WMS</w:t>
+            </w:r>
+          </w:p>
+        </w:tc>
+      </w:tr>
+      <w:tr>
+        <w:trPr>
+          <w:cantSplit/>
+          <w:tblHeader w:val="false"/>
+        </w:trPr>
+        <w:tc>
+          <w:tcPr>
+            <w:tcW w:type="dxa" w:w="4549"/>
+            <w:tcBorders>
+              <w:top w:val="single" w:color="D9D9D9" w:sz="4"/>
+              <w:left w:val="single" w:color="D9D9D9" w:sz="4"/>
+              <w:bottom w:val="single" w:color="D9D9D9" w:sz="4"/>
+              <w:right w:val="single" w:color="D9D9D9" w:sz="4"/>
+            </w:tcBorders>
+            <w:tcMar>
+              <w:top w:type="dxa" w:w="50"/>
+              <w:left w:type="dxa" w:w="90"/>
+              <w:bottom w:type="dxa" w:w="50"/>
+              <w:right w:type="dxa" w:w="90"/>
+            </w:tcMar>
+          </w:tcPr>
+          <w:p>
+            <w:pPr>
+              <w:spacing w:after="0" w:before="0"/>
+            </w:pPr>
+            <w:r>
+              <w:rPr>
+                <w:color w:val="1A1A1A"/>
+                <w:sz w:val="18"/>
+                <w:szCs w:val="18"/>
+              </w:rPr>
+              <w:t xml:space="preserve">Order / order line</w:t>
+            </w:r>
+          </w:p>
+        </w:tc>
+        <w:tc>
+          <w:tcPr>
+            <w:tcW w:type="dxa" w:w="5089"/>
+            <w:tcBorders>
+              <w:top w:val="single" w:color="D9D9D9" w:sz="4"/>
+              <w:left w:val="single" w:color="D9D9D9" w:sz="4"/>
+              <w:bottom w:val="single" w:color="D9D9D9" w:sz="4"/>
+              <w:right w:val="single" w:color="D9D9D9" w:sz="4"/>
+            </w:tcBorders>
+            <w:tcMar>
+              <w:top w:type="dxa" w:w="50"/>
+              <w:left w:type="dxa" w:w="90"/>
+              <w:bottom w:type="dxa" w:w="50"/>
+              <w:right w:type="dxa" w:w="90"/>
+            </w:tcMar>
+          </w:tcPr>
+          <w:p>
+            <w:pPr>
+              <w:spacing w:after="0" w:before="0"/>
+            </w:pPr>
+            <w:r>
+              <w:rPr>
+                <w:color w:val="1A1A1A"/>
+                <w:sz w:val="18"/>
+                <w:szCs w:val="18"/>
+              </w:rPr>
+              <w:t xml:space="preserve">an order is what one customer asks for; each different item on it is one order line</w:t>
+            </w:r>
+          </w:p>
+        </w:tc>
+      </w:tr>
+      <w:tr>
+        <w:trPr>
+          <w:cantSplit/>
+          <w:tblHeader w:val="false"/>
+        </w:trPr>
+        <w:tc>
+          <w:tcPr>
+            <w:tcW w:type="dxa" w:w="4549"/>
+            <w:tcBorders>
+              <w:top w:val="single" w:color="D9D9D9" w:sz="4"/>
+              <w:left w:val="single" w:color="D9D9D9" w:sz="4"/>
+              <w:bottom w:val="single" w:color="D9D9D9" w:sz="4"/>
+              <w:right w:val="single" w:color="D9D9D9" w:sz="4"/>
+            </w:tcBorders>
+            <w:tcMar>
+              <w:top w:type="dxa" w:w="50"/>
+              <w:left w:type="dxa" w:w="90"/>
+              <w:bottom w:type="dxa" w:w="50"/>
+              <w:right w:type="dxa" w:w="90"/>
+            </w:tcMar>
+          </w:tcPr>
+          <w:p>
+            <w:pPr>
+              <w:spacing w:after="0" w:before="0"/>
+            </w:pPr>
+            <w:r>
+              <w:rPr>
+                <w:color w:val="1A1A1A"/>
+                <w:sz w:val="18"/>
+                <w:szCs w:val="18"/>
+              </w:rPr>
+              <w:t xml:space="preserve">Average vs median</w:t>
+            </w:r>
+          </w:p>
+        </w:tc>
+        <w:tc>
+          <w:tcPr>
+            <w:tcW w:type="dxa" w:w="5089"/>
+            <w:tcBorders>
+              <w:top w:val="single" w:color="D9D9D9" w:sz="4"/>
+              <w:left w:val="single" w:color="D9D9D9" w:sz="4"/>
+              <w:bottom w:val="single" w:color="D9D9D9" w:sz="4"/>
+              <w:right w:val="single" w:color="D9D9D9" w:sz="4"/>
+            </w:tcBorders>
+            <w:tcMar>
+              <w:top w:type="dxa" w:w="50"/>
+              <w:left w:type="dxa" w:w="90"/>
+              <w:bottom w:type="dxa" w:w="50"/>
+              <w:right w:type="dxa" w:w="90"/>
+            </w:tcMar>
+          </w:tcPr>
+          <w:p>
+            <w:pPr>
+              <w:spacing w:after="0" w:before="0"/>
+            </w:pPr>
+            <w:r>
+              <w:rPr>
+                <w:color w:val="1A1A1A"/>
+                <w:sz w:val="18"/>
+                <w:szCs w:val="18"/>
+              </w:rPr>
+              <w:t xml:space="preserve">the average adds everything up and divides; the median is the middle value (half are lower, half higher), so a few extreme values don't pull it up</w:t>
+            </w:r>
+          </w:p>
+        </w:tc>
+      </w:tr>
+      <w:tr>
+        <w:trPr>
+          <w:cantSplit/>
+          <w:tblHeader w:val="false"/>
+        </w:trPr>
+        <w:tc>
+          <w:tcPr>
+            <w:tcW w:type="dxa" w:w="4549"/>
+            <w:tcBorders>
+              <w:top w:val="single" w:color="D9D9D9" w:sz="4"/>
+              <w:left w:val="single" w:color="D9D9D9" w:sz="4"/>
+              <w:bottom w:val="single" w:color="D9D9D9" w:sz="4"/>
+              <w:right w:val="single" w:color="D9D9D9" w:sz="4"/>
+            </w:tcBorders>
+            <w:tcMar>
+              <w:top w:type="dxa" w:w="50"/>
+              <w:left w:type="dxa" w:w="90"/>
+              <w:bottom w:type="dxa" w:w="50"/>
+              <w:right w:type="dxa" w:w="90"/>
+            </w:tcMar>
+          </w:tcPr>
+          <w:p>
+            <w:pPr>
+              <w:spacing w:after="0" w:before="0"/>
+            </w:pPr>
+            <w:r>
+              <w:rPr>
+                <w:color w:val="1A1A1A"/>
+                <w:sz w:val="18"/>
+                <w:szCs w:val="18"/>
+              </w:rPr>
+              <w:t xml:space="preserve">p90 / p95</w:t>
+            </w:r>
+          </w:p>
+        </w:tc>
+        <w:tc>
+          <w:tcPr>
+            <w:tcW w:type="dxa" w:w="5089"/>
+            <w:tcBorders>
+              <w:top w:val="single" w:color="D9D9D9" w:sz="4"/>
+              <w:left w:val="single" w:color="D9D9D9" w:sz="4"/>
+              <w:bottom w:val="single" w:color="D9D9D9" w:sz="4"/>
+              <w:right w:val="single" w:color="D9D9D9" w:sz="4"/>
+            </w:tcBorders>
+            <w:tcMar>
+              <w:top w:type="dxa" w:w="50"/>
+              <w:left w:type="dxa" w:w="90"/>
+              <w:bottom w:type="dxa" w:w="50"/>
+              <w:right w:type="dxa" w:w="90"/>
+            </w:tcMar>
+          </w:tcPr>
+          <w:p>
+            <w:pPr>
+              <w:spacing w:after="0" w:before="0"/>
+            </w:pPr>
+            <w:r>
+              <w:rPr>
+                <w:color w:val="1A1A1A"/>
+                <w:sz w:val="18"/>
+                <w:szCs w:val="18"/>
+              </w:rPr>
+              <w:t xml:space="preserve">the value that 90% (or 95%) of cases stay under. "The slowest 10%" means everything above p90</w:t>
+            </w:r>
+          </w:p>
+        </w:tc>
+      </w:tr>
+      <w:tr>
+        <w:trPr>
+          <w:cantSplit/>
+          <w:tblHeader w:val="false"/>
+        </w:trPr>
+        <w:tc>
+          <w:tcPr>
+            <w:tcW w:type="dxa" w:w="4549"/>
+            <w:tcBorders>
+              <w:top w:val="single" w:color="D9D9D9" w:sz="4"/>
+              <w:left w:val="single" w:color="D9D9D9" w:sz="4"/>
+              <w:bottom w:val="single" w:color="D9D9D9" w:sz="4"/>
+              <w:right w:val="single" w:color="D9D9D9" w:sz="4"/>
+            </w:tcBorders>
+            <w:tcMar>
+              <w:top w:type="dxa" w:w="50"/>
+              <w:left w:type="dxa" w:w="90"/>
+              <w:bottom w:type="dxa" w:w="50"/>
+              <w:right w:type="dxa" w:w="90"/>
+            </w:tcMar>
+          </w:tcPr>
+          <w:p>
+            <w:pPr>
+              <w:spacing w:after="0" w:before="0"/>
+            </w:pPr>
+            <w:r>
+              <w:rPr>
+                <w:color w:val="1A1A1A"/>
+                <w:sz w:val="18"/>
+                <w:szCs w:val="18"/>
+              </w:rPr>
+              <w:t xml:space="preserve">1.83× (peak factor)</w:t>
+            </w:r>
+          </w:p>
+        </w:tc>
+        <w:tc>
+          <w:tcPr>
+            <w:tcW w:type="dxa" w:w="5089"/>
+            <w:tcBorders>
+              <w:top w:val="single" w:color="D9D9D9" w:sz="4"/>
+              <w:left w:val="single" w:color="D9D9D9" w:sz="4"/>
+              <w:bottom w:val="single" w:color="D9D9D9" w:sz="4"/>
+              <w:right w:val="single" w:color="D9D9D9" w:sz="4"/>
+            </w:tcBorders>
+            <w:tcMar>
+              <w:top w:type="dxa" w:w="50"/>
+              <w:left w:type="dxa" w:w="90"/>
+              <w:bottom w:type="dxa" w:w="50"/>
+              <w:right w:type="dxa" w:w="90"/>
+            </w:tcMar>
+          </w:tcPr>
+          <w:p>
+            <w:pPr>
+              <w:spacing w:after="0" w:before="0"/>
+            </w:pPr>
+            <w:r>
+              <w:rPr>
+                <w:color w:val="1A1A1A"/>
+                <w:sz w:val="18"/>
+                <w:szCs w:val="18"/>
+              </w:rPr>
+              <w:t xml:space="preserve">the busiest day divided by an average day</w:t>
+            </w:r>
+          </w:p>
+        </w:tc>
+      </w:tr>
+      <w:tr>
+        <w:trPr>
+          <w:cantSplit/>
+          <w:tblHeader w:val="false"/>
+        </w:trPr>
+        <w:tc>
+          <w:tcPr>
+            <w:tcW w:type="dxa" w:w="4549"/>
+            <w:tcBorders>
+              <w:top w:val="single" w:color="D9D9D9" w:sz="4"/>
+              <w:left w:val="single" w:color="D9D9D9" w:sz="4"/>
+              <w:bottom w:val="single" w:color="D9D9D9" w:sz="4"/>
+              <w:right w:val="single" w:color="D9D9D9" w:sz="4"/>
+            </w:tcBorders>
+            <w:tcMar>
+              <w:top w:type="dxa" w:w="50"/>
+              <w:left w:type="dxa" w:w="90"/>
+              <w:bottom w:type="dxa" w:w="50"/>
+              <w:right w:type="dxa" w:w="90"/>
+            </w:tcMar>
+          </w:tcPr>
+          <w:p>
+            <w:pPr>
+              <w:spacing w:after="0" w:before="0"/>
+            </w:pPr>
+            <w:r>
+              <w:rPr>
+                <w:color w:val="1A1A1A"/>
+                <w:sz w:val="18"/>
+                <w:szCs w:val="18"/>
+              </w:rPr>
+              <w:t xml:space="preserve">FTE</w:t>
+            </w:r>
+          </w:p>
+        </w:tc>
+        <w:tc>
+          <w:tcPr>
+            <w:tcW w:type="dxa" w:w="5089"/>
+            <w:tcBorders>
+              <w:top w:val="single" w:color="D9D9D9" w:sz="4"/>
+              <w:left w:val="single" w:color="D9D9D9" w:sz="4"/>
+              <w:bottom w:val="single" w:color="D9D9D9" w:sz="4"/>
+              <w:right w:val="single" w:color="D9D9D9" w:sz="4"/>
+            </w:tcBorders>
+            <w:tcMar>
+              <w:top w:type="dxa" w:w="50"/>
+              <w:left w:type="dxa" w:w="90"/>
+              <w:bottom w:type="dxa" w:w="50"/>
+              <w:right w:type="dxa" w:w="90"/>
+            </w:tcMar>
+          </w:tcPr>
+          <w:p>
+            <w:pPr>
+              <w:spacing w:after="0" w:before="0"/>
+            </w:pPr>
+            <w:r>
+              <w:rPr>
+                <w:color w:val="1A1A1A"/>
+                <w:sz w:val="18"/>
+                <w:szCs w:val="18"/>
+              </w:rPr>
+              <w:t xml:space="preserve">full-time equivalent: one person working a full day (7.5 productive hours out of 8 paid)</w:t>
+            </w:r>
+          </w:p>
+        </w:tc>
+      </w:tr>
+      <w:tr>
+        <w:trPr>
+          <w:cantSplit/>
+          <w:tblHeader w:val="false"/>
+        </w:trPr>
+        <w:tc>
+          <w:tcPr>
+            <w:tcW w:type="dxa" w:w="4549"/>
+            <w:tcBorders>
+              <w:top w:val="single" w:color="D9D9D9" w:sz="4"/>
+              <w:left w:val="single" w:color="D9D9D9" w:sz="4"/>
+              <w:bottom w:val="single" w:color="D9D9D9" w:sz="4"/>
+              <w:right w:val="single" w:color="D9D9D9" w:sz="4"/>
+            </w:tcBorders>
+            <w:tcMar>
+              <w:top w:type="dxa" w:w="50"/>
+              <w:left w:type="dxa" w:w="90"/>
+              <w:bottom w:type="dxa" w:w="50"/>
+              <w:right w:type="dxa" w:w="90"/>
+            </w:tcMar>
+          </w:tcPr>
+          <w:p>
+            <w:pPr>
+              <w:spacing w:after="0" w:before="0"/>
+            </w:pPr>
+            <w:r>
+              <w:rPr>
+                <w:color w:val="1A1A1A"/>
+                <w:sz w:val="18"/>
+                <w:szCs w:val="18"/>
+              </w:rPr>
+              <w:t xml:space="preserve">Picker-hours</w:t>
+            </w:r>
+          </w:p>
+        </w:tc>
+        <w:tc>
+          <w:tcPr>
+            <w:tcW w:type="dxa" w:w="5089"/>
+            <w:tcBorders>
+              <w:top w:val="single" w:color="D9D9D9" w:sz="4"/>
+              <w:left w:val="single" w:color="D9D9D9" w:sz="4"/>
+              <w:bottom w:val="single" w:color="D9D9D9" w:sz="4"/>
+              <w:right w:val="single" w:color="D9D9D9" w:sz="4"/>
+            </w:tcBorders>
+            <w:tcMar>
+              <w:top w:type="dxa" w:w="50"/>
+              <w:left w:type="dxa" w:w="90"/>
+              <w:bottom w:type="dxa" w:w="50"/>
+              <w:right w:type="dxa" w:w="90"/>
+            </w:tcMar>
+          </w:tcPr>
+          <w:p>
+            <w:pPr>
+              <w:spacing w:after="0" w:before="0"/>
+            </w:pPr>
+            <w:r>
+              <w:rPr>
+                <w:color w:val="1A1A1A"/>
+                <w:sz w:val="18"/>
+                <w:szCs w:val="18"/>
+              </w:rPr>
+              <w:t xml:space="preserve">hours of picking work in a day; 11.7 picker-hours is about 1.6 people</w:t>
+            </w:r>
+          </w:p>
+        </w:tc>
+      </w:tr>
+      <w:tr>
+        <w:trPr>
+          <w:cantSplit/>
+          <w:tblHeader w:val="false"/>
+        </w:trPr>
+        <w:tc>
+          <w:tcPr>
+            <w:tcW w:type="dxa" w:w="4549"/>
+            <w:tcBorders>
+              <w:top w:val="single" w:color="D9D9D9" w:sz="4"/>
+              <w:left w:val="single" w:color="D9D9D9" w:sz="4"/>
+              <w:bottom w:val="single" w:color="D9D9D9" w:sz="4"/>
+              <w:right w:val="single" w:color="D9D9D9" w:sz="4"/>
+            </w:tcBorders>
+            <w:tcMar>
+              <w:top w:type="dxa" w:w="50"/>
+              <w:left w:type="dxa" w:w="90"/>
+              <w:bottom w:type="dxa" w:w="50"/>
+              <w:right w:type="dxa" w:w="90"/>
+            </w:tcMar>
+          </w:tcPr>
+          <w:p>
+            <w:pPr>
+              <w:spacing w:after="0" w:before="0"/>
+            </w:pPr>
+            <w:r>
+              <w:rPr>
+                <w:color w:val="1A1A1A"/>
+                <w:sz w:val="18"/>
+                <w:szCs w:val="18"/>
+              </w:rPr>
+              <w:t xml:space="preserve">KPI</w:t>
+            </w:r>
+          </w:p>
+        </w:tc>
+        <w:tc>
+          <w:tcPr>
+            <w:tcW w:type="dxa" w:w="5089"/>
+            <w:tcBorders>
+              <w:top w:val="single" w:color="D9D9D9" w:sz="4"/>
+              <w:left w:val="single" w:color="D9D9D9" w:sz="4"/>
+              <w:bottom w:val="single" w:color="D9D9D9" w:sz="4"/>
+              <w:right w:val="single" w:color="D9D9D9" w:sz="4"/>
+            </w:tcBorders>
+            <w:tcMar>
+              <w:top w:type="dxa" w:w="50"/>
+              <w:left w:type="dxa" w:w="90"/>
+              <w:bottom w:type="dxa" w:w="50"/>
+              <w:right w:type="dxa" w:w="90"/>
+            </w:tcMar>
+          </w:tcPr>
+          <w:p>
+            <w:pPr>
+              <w:spacing w:after="0" w:before="0"/>
+            </w:pPr>
+            <w:r>
+              <w:rPr>
+                <w:color w:val="1A1A1A"/>
+                <w:sz w:val="18"/>
+                <w:szCs w:val="18"/>
+              </w:rPr>
+              <w:t xml:space="preserve">key performance indicator: a number we track to see if the operation works as planned</w:t>
+            </w:r>
+          </w:p>
+        </w:tc>
+      </w:tr>
+      <w:tr>
+        <w:trPr>
+          <w:cantSplit/>
+          <w:tblHeader w:val="false"/>
+        </w:trPr>
+        <w:tc>
+          <w:tcPr>
+            <w:tcW w:type="dxa" w:w="4549"/>
+            <w:tcBorders>
+              <w:top w:val="single" w:color="D9D9D9" w:sz="4"/>
+              <w:left w:val="single" w:color="D9D9D9" w:sz="4"/>
+              <w:bottom w:val="single" w:color="D9D9D9" w:sz="4"/>
+              <w:right w:val="single" w:color="D9D9D9" w:sz="4"/>
+            </w:tcBorders>
+            <w:tcMar>
+              <w:top w:type="dxa" w:w="50"/>
+              <w:left w:type="dxa" w:w="90"/>
+              <w:bottom w:type="dxa" w:w="50"/>
+              <w:right w:type="dxa" w:w="90"/>
+            </w:tcMar>
+          </w:tcPr>
+          <w:p>
+            <w:pPr>
+              <w:spacing w:after="0" w:before="0"/>
+            </w:pPr>
+            <w:r>
+              <w:rPr>
+                <w:color w:val="1A1A1A"/>
+                <w:sz w:val="18"/>
+                <w:szCs w:val="18"/>
+              </w:rPr>
+              <w:t xml:space="preserve">Measured / modelled / assumption / benchmark / target</w:t>
+            </w:r>
+          </w:p>
+        </w:tc>
+        <w:tc>
+          <w:tcPr>
+            <w:tcW w:type="dxa" w:w="5089"/>
+            <w:tcBorders>
+              <w:top w:val="single" w:color="D9D9D9" w:sz="4"/>
+              <w:left w:val="single" w:color="D9D9D9" w:sz="4"/>
+              <w:bottom w:val="single" w:color="D9D9D9" w:sz="4"/>
+              <w:right w:val="single" w:color="D9D9D9" w:sz="4"/>
+            </w:tcBorders>
+            <w:tcMar>
+              <w:top w:type="dxa" w:w="50"/>
+              <w:left w:type="dxa" w:w="90"/>
+              <w:bottom w:type="dxa" w:w="50"/>
+              <w:right w:type="dxa" w:w="90"/>
+            </w:tcMar>
+          </w:tcPr>
+          <w:p>
+            <w:pPr>
+              <w:spacing w:after="0" w:before="0"/>
+            </w:pPr>
+            <w:r>
+              <w:rPr>
+                <w:color w:val="1A1A1A"/>
+                <w:sz w:val="18"/>
+                <w:szCs w:val="18"/>
+              </w:rPr>
+              <w:t xml:space="preserve">measured = straight from Assa Abloy's data; modelled = our calculation on that data; assumption = a value we chose and wrote down with its reason; benchmark = a typical value from a public source; target = what the design is built to reach</w:t>
+            </w:r>
+          </w:p>
+        </w:tc>
+      </w:tr>
+      <w:tr>
+        <w:trPr>
+          <w:cantSplit/>
+          <w:tblHeader w:val="false"/>
+        </w:trPr>
+        <w:tc>
+          <w:tcPr>
+            <w:tcW w:type="dxa" w:w="4549"/>
+            <w:tcBorders>
+              <w:top w:val="single" w:color="D9D9D9" w:sz="4"/>
+              <w:left w:val="single" w:color="D9D9D9" w:sz="4"/>
+              <w:bottom w:val="single" w:color="D9D9D9" w:sz="4"/>
+              <w:right w:val="single" w:color="D9D9D9" w:sz="4"/>
+            </w:tcBorders>
+            <w:tcMar>
+              <w:top w:type="dxa" w:w="50"/>
+              <w:left w:type="dxa" w:w="90"/>
+              <w:bottom w:type="dxa" w:w="50"/>
+              <w:right w:type="dxa" w:w="90"/>
+            </w:tcMar>
+          </w:tcPr>
+          <w:p>
+            <w:pPr>
+              <w:spacing w:after="0" w:before="0"/>
+            </w:pPr>
+            <w:r>
+              <w:rPr>
+                <w:color w:val="1A1A1A"/>
+                <w:sz w:val="18"/>
+                <w:szCs w:val="18"/>
+              </w:rPr>
+              <w:t xml:space="preserve">Assumption register</w:t>
+            </w:r>
+          </w:p>
+        </w:tc>
+        <w:tc>
+          <w:tcPr>
+            <w:tcW w:type="dxa" w:w="5089"/>
+            <w:tcBorders>
+              <w:top w:val="single" w:color="D9D9D9" w:sz="4"/>
+              <w:left w:val="single" w:color="D9D9D9" w:sz="4"/>
+              <w:bottom w:val="single" w:color="D9D9D9" w:sz="4"/>
+              <w:right w:val="single" w:color="D9D9D9" w:sz="4"/>
+            </w:tcBorders>
+            <w:tcMar>
+              <w:top w:type="dxa" w:w="50"/>
+              <w:left w:type="dxa" w:w="90"/>
+              <w:bottom w:type="dxa" w:w="50"/>
+              <w:right w:type="dxa" w:w="90"/>
+            </w:tcMar>
+          </w:tcPr>
+          <w:p>
+            <w:pPr>
+              <w:spacing w:after="0" w:before="0"/>
+            </w:pPr>
+            <w:r>
+              <w:rPr>
+                <w:color w:val="1A1A1A"/>
+                <w:sz w:val="18"/>
+                <w:szCs w:val="18"/>
+              </w:rPr>
+              <w:t xml:space="preserve">our list of 46 assumptions (data/assumptions.json), each with its reason, source and impact</w:t>
+            </w:r>
+          </w:p>
+        </w:tc>
+      </w:tr>
+      <w:tr>
+        <w:trPr>
+          <w:cantSplit/>
+          <w:tblHeader w:val="false"/>
+        </w:trPr>
+        <w:tc>
+          <w:tcPr>
+            <w:tcW w:type="dxa" w:w="4549"/>
+            <w:tcBorders>
+              <w:top w:val="single" w:color="D9D9D9" w:sz="4"/>
+              <w:left w:val="single" w:color="D9D9D9" w:sz="4"/>
+              <w:bottom w:val="single" w:color="D9D9D9" w:sz="4"/>
+              <w:right w:val="single" w:color="D9D9D9" w:sz="4"/>
+            </w:tcBorders>
+            <w:tcMar>
+              <w:top w:type="dxa" w:w="50"/>
+              <w:left w:type="dxa" w:w="90"/>
+              <w:bottom w:type="dxa" w:w="50"/>
+              <w:right w:type="dxa" w:w="90"/>
+            </w:tcMar>
+          </w:tcPr>
+          <w:p>
+            <w:pPr>
+              <w:spacing w:after="0" w:before="0"/>
+            </w:pPr>
+            <w:r>
+              <w:rPr>
+                <w:color w:val="1A1A1A"/>
+                <w:sz w:val="18"/>
+                <w:szCs w:val="18"/>
+              </w:rPr>
+              <w:t xml:space="preserve">Option A / B / C</w:t>
+            </w:r>
+          </w:p>
+        </w:tc>
+        <w:tc>
+          <w:tcPr>
+            <w:tcW w:type="dxa" w:w="5089"/>
+            <w:tcBorders>
+              <w:top w:val="single" w:color="D9D9D9" w:sz="4"/>
+              <w:left w:val="single" w:color="D9D9D9" w:sz="4"/>
+              <w:bottom w:val="single" w:color="D9D9D9" w:sz="4"/>
+              <w:right w:val="single" w:color="D9D9D9" w:sz="4"/>
+            </w:tcBorders>
+            <w:tcMar>
+              <w:top w:type="dxa" w:w="50"/>
+              <w:left w:type="dxa" w:w="90"/>
+              <w:bottom w:type="dxa" w:w="50"/>
+              <w:right w:type="dxa" w:w="90"/>
+            </w:tcMar>
+          </w:tcPr>
+          <w:p>
+            <w:pPr>
+              <w:spacing w:after="0" w:before="0"/>
+            </w:pPr>
+            <w:r>
+              <w:rPr>
+                <w:color w:val="1A1A1A"/>
+                <w:sz w:val="18"/>
+                <w:szCs w:val="18"/>
+              </w:rPr>
+              <w:t xml:space="preserve">the three designs we compared: A = today's way tidied up; B = hybrid (chosen); C = semi-automated</w:t>
+            </w:r>
+          </w:p>
+        </w:tc>
+      </w:tr>
+      <w:tr>
+        <w:trPr>
+          <w:cantSplit/>
+          <w:tblHeader w:val="false"/>
+        </w:trPr>
+        <w:tc>
+          <w:tcPr>
+            <w:tcW w:type="dxa" w:w="4549"/>
+            <w:tcBorders>
+              <w:top w:val="single" w:color="D9D9D9" w:sz="4"/>
+              <w:left w:val="single" w:color="D9D9D9" w:sz="4"/>
+              <w:bottom w:val="single" w:color="D9D9D9" w:sz="4"/>
+              <w:right w:val="single" w:color="D9D9D9" w:sz="4"/>
+            </w:tcBorders>
+            <w:tcMar>
+              <w:top w:type="dxa" w:w="50"/>
+              <w:left w:type="dxa" w:w="90"/>
+              <w:bottom w:type="dxa" w:w="50"/>
+              <w:right w:type="dxa" w:w="90"/>
+            </w:tcMar>
+          </w:tcPr>
+          <w:p>
+            <w:pPr>
+              <w:spacing w:after="0" w:before="0"/>
+            </w:pPr>
+            <w:r>
+              <w:rPr>
+                <w:color w:val="1A1A1A"/>
+                <w:sz w:val="18"/>
+                <w:szCs w:val="18"/>
+              </w:rPr>
+              <w:t xml:space="preserve">Four V's</w:t>
+            </w:r>
+          </w:p>
+        </w:tc>
+        <w:tc>
+          <w:tcPr>
+            <w:tcW w:type="dxa" w:w="5089"/>
+            <w:tcBorders>
+              <w:top w:val="single" w:color="D9D9D9" w:sz="4"/>
+              <w:left w:val="single" w:color="D9D9D9" w:sz="4"/>
+              <w:bottom w:val="single" w:color="D9D9D9" w:sz="4"/>
+              <w:right w:val="single" w:color="D9D9D9" w:sz="4"/>
+            </w:tcBorders>
+            <w:tcMar>
+              <w:top w:type="dxa" w:w="50"/>
+              <w:left w:type="dxa" w:w="90"/>
+              <w:bottom w:type="dxa" w:w="50"/>
+              <w:right w:type="dxa" w:w="90"/>
+            </w:tcMar>
+          </w:tcPr>
+          <w:p>
+            <w:pPr>
+              <w:spacing w:after="0" w:before="0"/>
+            </w:pPr>
+            <w:r>
+              <w:rPr>
+                <w:color w:val="1A1A1A"/>
+                <w:sz w:val="18"/>
+                <w:szCs w:val="18"/>
+              </w:rPr>
+              <w:t xml:space="preserve">volume, variety, variation and visibility: four ways to describe an operation (Slack et al., 2022)</w:t>
+            </w:r>
+          </w:p>
+        </w:tc>
+      </w:tr>
+      <w:tr>
+        <w:trPr>
+          <w:cantSplit/>
+          <w:tblHeader w:val="false"/>
+        </w:trPr>
+        <w:tc>
+          <w:tcPr>
+            <w:tcW w:type="dxa" w:w="4549"/>
+            <w:tcBorders>
+              <w:top w:val="single" w:color="D9D9D9" w:sz="4"/>
+              <w:left w:val="single" w:color="D9D9D9" w:sz="4"/>
+              <w:bottom w:val="single" w:color="D9D9D9" w:sz="4"/>
+              <w:right w:val="single" w:color="D9D9D9" w:sz="4"/>
+            </w:tcBorders>
+            <w:tcMar>
+              <w:top w:type="dxa" w:w="50"/>
+              <w:left w:type="dxa" w:w="90"/>
+              <w:bottom w:type="dxa" w:w="50"/>
+              <w:right w:type="dxa" w:w="90"/>
+            </w:tcMar>
+          </w:tcPr>
+          <w:p>
+            <w:pPr>
+              <w:spacing w:after="0" w:before="0"/>
+            </w:pPr>
+            <w:r>
+              <w:rPr>
+                <w:color w:val="1A1A1A"/>
+                <w:sz w:val="18"/>
+                <w:szCs w:val="18"/>
+              </w:rPr>
+              <w:t xml:space="preserve">Fast-pick area</w:t>
+            </w:r>
+          </w:p>
+        </w:tc>
+        <w:tc>
+          <w:tcPr>
+            <w:tcW w:type="dxa" w:w="5089"/>
+            <w:tcBorders>
+              <w:top w:val="single" w:color="D9D9D9" w:sz="4"/>
+              <w:left w:val="single" w:color="D9D9D9" w:sz="4"/>
+              <w:bottom w:val="single" w:color="D9D9D9" w:sz="4"/>
+              <w:right w:val="single" w:color="D9D9D9" w:sz="4"/>
+            </w:tcBorders>
+            <w:tcMar>
+              <w:top w:type="dxa" w:w="50"/>
+              <w:left w:type="dxa" w:w="90"/>
+              <w:bottom w:type="dxa" w:w="50"/>
+              <w:right w:type="dxa" w:w="90"/>
+            </w:tcMar>
+          </w:tcPr>
+          <w:p>
+            <w:pPr>
+              <w:spacing w:after="0" w:before="0"/>
+            </w:pPr>
+            <w:r>
+              <w:rPr>
+                <w:color w:val="1A1A1A"/>
+                <w:sz w:val="18"/>
+                <w:szCs w:val="18"/>
+              </w:rPr>
+              <w:t xml:space="preserve">the zone along the south wall where the 1,409 best-sellers each have a pick face, close to packing</w:t>
+            </w:r>
+          </w:p>
+        </w:tc>
+      </w:tr>
+      <w:tr>
+        <w:trPr>
+          <w:cantSplit/>
+          <w:tblHeader w:val="false"/>
+        </w:trPr>
+        <w:tc>
+          <w:tcPr>
+            <w:tcW w:type="dxa" w:w="4549"/>
+            <w:tcBorders>
+              <w:top w:val="single" w:color="D9D9D9" w:sz="4"/>
+              <w:left w:val="single" w:color="D9D9D9" w:sz="4"/>
+              <w:bottom w:val="single" w:color="D9D9D9" w:sz="4"/>
+              <w:right w:val="single" w:color="D9D9D9" w:sz="4"/>
+            </w:tcBorders>
+            <w:tcMar>
+              <w:top w:type="dxa" w:w="50"/>
+              <w:left w:type="dxa" w:w="90"/>
+              <w:bottom w:type="dxa" w:w="50"/>
+              <w:right w:type="dxa" w:w="90"/>
+            </w:tcMar>
+          </w:tcPr>
+          <w:p>
+            <w:pPr>
+              <w:spacing w:after="0" w:before="0"/>
+            </w:pPr>
+            <w:r>
+              <w:rPr>
+                <w:color w:val="1A1A1A"/>
+                <w:sz w:val="18"/>
+                <w:szCs w:val="18"/>
+              </w:rPr>
+              <w:t xml:space="preserve">Reserve (pallet racks)</w:t>
+            </w:r>
+          </w:p>
+        </w:tc>
+        <w:tc>
+          <w:tcPr>
+            <w:tcW w:type="dxa" w:w="5089"/>
+            <w:tcBorders>
+              <w:top w:val="single" w:color="D9D9D9" w:sz="4"/>
+              <w:left w:val="single" w:color="D9D9D9" w:sz="4"/>
+              <w:bottom w:val="single" w:color="D9D9D9" w:sz="4"/>
+              <w:right w:val="single" w:color="D9D9D9" w:sz="4"/>
+            </w:tcBorders>
+            <w:tcMar>
+              <w:top w:type="dxa" w:w="50"/>
+              <w:left w:type="dxa" w:w="90"/>
+              <w:bottom w:type="dxa" w:w="50"/>
+              <w:right w:type="dxa" w:w="90"/>
+            </w:tcMar>
+          </w:tcPr>
+          <w:p>
+            <w:pPr>
+              <w:spacing w:after="0" w:before="0"/>
+            </w:pPr>
+            <w:r>
+              <w:rPr>
+                <w:color w:val="1A1A1A"/>
+                <w:sz w:val="18"/>
+                <w:szCs w:val="18"/>
+              </w:rPr>
+              <w:t xml:space="preserve">the high racks where full pallets are stored until they are needed</w:t>
+            </w:r>
+          </w:p>
+        </w:tc>
+      </w:tr>
+      <w:tr>
+        <w:trPr>
+          <w:cantSplit/>
+          <w:tblHeader w:val="false"/>
+        </w:trPr>
+        <w:tc>
+          <w:tcPr>
+            <w:tcW w:type="dxa" w:w="4549"/>
+            <w:tcBorders>
+              <w:top w:val="single" w:color="D9D9D9" w:sz="4"/>
+              <w:left w:val="single" w:color="D9D9D9" w:sz="4"/>
+              <w:bottom w:val="single" w:color="D9D9D9" w:sz="4"/>
+              <w:right w:val="single" w:color="D9D9D9" w:sz="4"/>
+            </w:tcBorders>
+            <w:tcMar>
+              <w:top w:type="dxa" w:w="50"/>
+              <w:left w:type="dxa" w:w="90"/>
+              <w:bottom w:type="dxa" w:w="50"/>
+              <w:right w:type="dxa" w:w="90"/>
+            </w:tcMar>
+          </w:tcPr>
+          <w:p>
+            <w:pPr>
+              <w:spacing w:after="0" w:before="0"/>
+            </w:pPr>
+            <w:r>
+              <w:rPr>
+                <w:color w:val="1A1A1A"/>
+                <w:sz w:val="18"/>
+                <w:szCs w:val="18"/>
+              </w:rPr>
+              <w:t xml:space="preserve">Single-deep rack</w:t>
+            </w:r>
+          </w:p>
+        </w:tc>
+        <w:tc>
+          <w:tcPr>
+            <w:tcW w:type="dxa" w:w="5089"/>
+            <w:tcBorders>
+              <w:top w:val="single" w:color="D9D9D9" w:sz="4"/>
+              <w:left w:val="single" w:color="D9D9D9" w:sz="4"/>
+              <w:bottom w:val="single" w:color="D9D9D9" w:sz="4"/>
+              <w:right w:val="single" w:color="D9D9D9" w:sz="4"/>
+            </w:tcBorders>
+            <w:tcMar>
+              <w:top w:type="dxa" w:w="50"/>
+              <w:left w:type="dxa" w:w="90"/>
+              <w:bottom w:type="dxa" w:w="50"/>
+              <w:right w:type="dxa" w:w="90"/>
+            </w:tcMar>
+          </w:tcPr>
+          <w:p>
+            <w:pPr>
+              <w:spacing w:after="0" w:before="0"/>
+            </w:pPr>
+            <w:r>
+              <w:rPr>
+                <w:color w:val="1A1A1A"/>
+                <w:sz w:val="18"/>
+                <w:szCs w:val="18"/>
+              </w:rPr>
+              <w:t xml:space="preserve">a rack with one pallet behind each face, so every pallet can be taken out without moving another</w:t>
+            </w:r>
+          </w:p>
+        </w:tc>
+      </w:tr>
+      <w:tr>
+        <w:trPr>
+          <w:cantSplit/>
+          <w:tblHeader w:val="false"/>
+        </w:trPr>
+        <w:tc>
+          <w:tcPr>
+            <w:tcW w:type="dxa" w:w="4549"/>
+            <w:tcBorders>
+              <w:top w:val="single" w:color="D9D9D9" w:sz="4"/>
+              <w:left w:val="single" w:color="D9D9D9" w:sz="4"/>
+              <w:bottom w:val="single" w:color="D9D9D9" w:sz="4"/>
+              <w:right w:val="single" w:color="D9D9D9" w:sz="4"/>
+            </w:tcBorders>
+            <w:tcMar>
+              <w:top w:type="dxa" w:w="50"/>
+              <w:left w:type="dxa" w:w="90"/>
+              <w:bottom w:type="dxa" w:w="50"/>
+              <w:right w:type="dxa" w:w="90"/>
+            </w:tcMar>
+          </w:tcPr>
+          <w:p>
+            <w:pPr>
+              <w:spacing w:after="0" w:before="0"/>
+            </w:pPr>
+            <w:r>
+              <w:rPr>
+                <w:color w:val="1A1A1A"/>
+                <w:sz w:val="18"/>
+                <w:szCs w:val="18"/>
+              </w:rPr>
+              <w:t xml:space="preserve">Wave</w:t>
+            </w:r>
+          </w:p>
+        </w:tc>
+        <w:tc>
+          <w:tcPr>
+            <w:tcW w:type="dxa" w:w="5089"/>
+            <w:tcBorders>
+              <w:top w:val="single" w:color="D9D9D9" w:sz="4"/>
+              <w:left w:val="single" w:color="D9D9D9" w:sz="4"/>
+              <w:bottom w:val="single" w:color="D9D9D9" w:sz="4"/>
+              <w:right w:val="single" w:color="D9D9D9" w:sz="4"/>
+            </w:tcBorders>
+            <w:tcMar>
+              <w:top w:type="dxa" w:w="50"/>
+              <w:left w:type="dxa" w:w="90"/>
+              <w:bottom w:type="dxa" w:w="50"/>
+              <w:right w:type="dxa" w:w="90"/>
+            </w:tcMar>
+          </w:tcPr>
+          <w:p>
+            <w:pPr>
+              <w:spacing w:after="0" w:before="0"/>
+            </w:pPr>
+            <w:r>
+              <w:rPr>
+                <w:color w:val="1A1A1A"/>
+                <w:sz w:val="18"/>
+                <w:szCs w:val="18"/>
+              </w:rPr>
+              <w:t xml:space="preserve">a portion of the day's orders released to the floor together; we use 3 a day</w:t>
+            </w:r>
+          </w:p>
+        </w:tc>
+      </w:tr>
+      <w:tr>
+        <w:trPr>
+          <w:cantSplit/>
+          <w:tblHeader w:val="false"/>
+        </w:trPr>
+        <w:tc>
+          <w:tcPr>
+            <w:tcW w:type="dxa" w:w="4549"/>
+            <w:tcBorders>
+              <w:top w:val="single" w:color="D9D9D9" w:sz="4"/>
+              <w:left w:val="single" w:color="D9D9D9" w:sz="4"/>
+              <w:bottom w:val="single" w:color="D9D9D9" w:sz="4"/>
+              <w:right w:val="single" w:color="D9D9D9" w:sz="4"/>
+            </w:tcBorders>
+            <w:tcMar>
+              <w:top w:type="dxa" w:w="50"/>
+              <w:left w:type="dxa" w:w="90"/>
+              <w:bottom w:type="dxa" w:w="50"/>
+              <w:right w:type="dxa" w:w="90"/>
+            </w:tcMar>
+          </w:tcPr>
+          <w:p>
+            <w:pPr>
+              <w:spacing w:after="0" w:before="0"/>
+            </w:pPr>
+            <w:r>
+              <w:rPr>
+                <w:color w:val="1A1A1A"/>
+                <w:sz w:val="18"/>
+                <w:szCs w:val="18"/>
+              </w:rPr>
+              <w:t xml:space="preserve">Put-to-light wall</w:t>
+            </w:r>
+          </w:p>
+        </w:tc>
+        <w:tc>
+          <w:tcPr>
+            <w:tcW w:type="dxa" w:w="5089"/>
+            <w:tcBorders>
+              <w:top w:val="single" w:color="D9D9D9" w:sz="4"/>
+              <w:left w:val="single" w:color="D9D9D9" w:sz="4"/>
+              <w:bottom w:val="single" w:color="D9D9D9" w:sz="4"/>
+              <w:right w:val="single" w:color="D9D9D9" w:sz="4"/>
+            </w:tcBorders>
+            <w:tcMar>
+              <w:top w:type="dxa" w:w="50"/>
+              <w:left w:type="dxa" w:w="90"/>
+              <w:bottom w:type="dxa" w:w="50"/>
+              <w:right w:type="dxa" w:w="90"/>
+            </w:tcMar>
+          </w:tcPr>
+          <w:p>
+            <w:pPr>
+              <w:spacing w:after="0" w:before="0"/>
+            </w:pPr>
+            <w:r>
+              <w:rPr>
+                <w:color w:val="1A1A1A"/>
+                <w:sz w:val="18"/>
+                <w:szCs w:val="18"/>
+              </w:rPr>
+              <w:t xml:space="preserve">a wall of 120 slots with lights at packing; it sorts batch-picked items into their orders</w:t>
+            </w:r>
+          </w:p>
+        </w:tc>
+      </w:tr>
+      <w:tr>
+        <w:trPr>
+          <w:cantSplit/>
+          <w:tblHeader w:val="false"/>
+        </w:trPr>
+        <w:tc>
+          <w:tcPr>
+            <w:tcW w:type="dxa" w:w="4549"/>
+            <w:tcBorders>
+              <w:top w:val="single" w:color="D9D9D9" w:sz="4"/>
+              <w:left w:val="single" w:color="D9D9D9" w:sz="4"/>
+              <w:bottom w:val="single" w:color="D9D9D9" w:sz="4"/>
+              <w:right w:val="single" w:color="D9D9D9" w:sz="4"/>
+            </w:tcBorders>
+            <w:tcMar>
+              <w:top w:type="dxa" w:w="50"/>
+              <w:left w:type="dxa" w:w="90"/>
+              <w:bottom w:type="dxa" w:w="50"/>
+              <w:right w:type="dxa" w:w="90"/>
+            </w:tcMar>
+          </w:tcPr>
+          <w:p>
+            <w:pPr>
+              <w:spacing w:after="0" w:before="0"/>
+            </w:pPr>
+            <w:r>
+              <w:rPr>
+                <w:color w:val="1A1A1A"/>
+                <w:sz w:val="18"/>
+                <w:szCs w:val="18"/>
+              </w:rPr>
+              <w:t xml:space="preserve">Staging lane</w:t>
+            </w:r>
+          </w:p>
+        </w:tc>
+        <w:tc>
+          <w:tcPr>
+            <w:tcW w:type="dxa" w:w="5089"/>
+            <w:tcBorders>
+              <w:top w:val="single" w:color="D9D9D9" w:sz="4"/>
+              <w:left w:val="single" w:color="D9D9D9" w:sz="4"/>
+              <w:bottom w:val="single" w:color="D9D9D9" w:sz="4"/>
+              <w:right w:val="single" w:color="D9D9D9" w:sz="4"/>
+            </w:tcBorders>
+            <w:tcMar>
+              <w:top w:type="dxa" w:w="50"/>
+              <w:left w:type="dxa" w:w="90"/>
+              <w:bottom w:type="dxa" w:w="50"/>
+              <w:right w:type="dxa" w:w="90"/>
+            </w:tcMar>
+          </w:tcPr>
+          <w:p>
+            <w:pPr>
+              <w:spacing w:after="0" w:before="0"/>
+            </w:pPr>
+            <w:r>
+              <w:rPr>
+                <w:color w:val="1A1A1A"/>
+                <w:sz w:val="18"/>
+                <w:szCs w:val="18"/>
+              </w:rPr>
+              <w:t xml:space="preserve">floor area in front of a shipping door where goods wait for their trailer</w:t>
+            </w:r>
+          </w:p>
+        </w:tc>
+      </w:tr>
+      <w:tr>
+        <w:trPr>
+          <w:cantSplit/>
+          <w:tblHeader w:val="false"/>
+        </w:trPr>
+        <w:tc>
+          <w:tcPr>
+            <w:tcW w:type="dxa" w:w="4549"/>
+            <w:tcBorders>
+              <w:top w:val="single" w:color="D9D9D9" w:sz="4"/>
+              <w:left w:val="single" w:color="D9D9D9" w:sz="4"/>
+              <w:bottom w:val="single" w:color="D9D9D9" w:sz="4"/>
+              <w:right w:val="single" w:color="D9D9D9" w:sz="4"/>
+            </w:tcBorders>
+            <w:tcMar>
+              <w:top w:type="dxa" w:w="50"/>
+              <w:left w:type="dxa" w:w="90"/>
+              <w:bottom w:type="dxa" w:w="50"/>
+              <w:right w:type="dxa" w:w="90"/>
+            </w:tcMar>
+          </w:tcPr>
+          <w:p>
+            <w:pPr>
+              <w:spacing w:after="0" w:before="0"/>
+            </w:pPr>
+            <w:r>
+              <w:rPr>
+                <w:color w:val="1A1A1A"/>
+                <w:sz w:val="18"/>
+                <w:szCs w:val="18"/>
+              </w:rPr>
+              <w:t xml:space="preserve">R1–R3 / S1–S5</w:t>
+            </w:r>
+          </w:p>
+        </w:tc>
+        <w:tc>
+          <w:tcPr>
+            <w:tcW w:type="dxa" w:w="5089"/>
+            <w:tcBorders>
+              <w:top w:val="single" w:color="D9D9D9" w:sz="4"/>
+              <w:left w:val="single" w:color="D9D9D9" w:sz="4"/>
+              <w:bottom w:val="single" w:color="D9D9D9" w:sz="4"/>
+              <w:right w:val="single" w:color="D9D9D9" w:sz="4"/>
+            </w:tcBorders>
+            <w:tcMar>
+              <w:top w:type="dxa" w:w="50"/>
+              <w:left w:type="dxa" w:w="90"/>
+              <w:bottom w:type="dxa" w:w="50"/>
+              <w:right w:type="dxa" w:w="90"/>
+            </w:tcMar>
+          </w:tcPr>
+          <w:p>
+            <w:pPr>
+              <w:spacing w:after="0" w:before="0"/>
+            </w:pPr>
+            <w:r>
+              <w:rPr>
+                <w:color w:val="1A1A1A"/>
+                <w:sz w:val="18"/>
+                <w:szCs w:val="18"/>
+              </w:rPr>
+              <w:t xml:space="preserve">the receiving doors (west wall) / the shipping doors (east wall)</w:t>
+            </w:r>
+          </w:p>
+        </w:tc>
+      </w:tr>
+      <w:tr>
+        <w:trPr>
+          <w:cantSplit/>
+          <w:tblHeader w:val="false"/>
+        </w:trPr>
+        <w:tc>
+          <w:tcPr>
+            <w:tcW w:type="dxa" w:w="4549"/>
+            <w:tcBorders>
+              <w:top w:val="single" w:color="D9D9D9" w:sz="4"/>
+              <w:left w:val="single" w:color="D9D9D9" w:sz="4"/>
+              <w:bottom w:val="single" w:color="D9D9D9" w:sz="4"/>
+              <w:right w:val="single" w:color="D9D9D9" w:sz="4"/>
+            </w:tcBorders>
+            <w:tcMar>
+              <w:top w:type="dxa" w:w="50"/>
+              <w:left w:type="dxa" w:w="90"/>
+              <w:bottom w:type="dxa" w:w="50"/>
+              <w:right w:type="dxa" w:w="90"/>
+            </w:tcMar>
+          </w:tcPr>
+          <w:p>
+            <w:pPr>
+              <w:spacing w:after="0" w:before="0"/>
+            </w:pPr>
+            <w:r>
+              <w:rPr>
+                <w:color w:val="1A1A1A"/>
+                <w:sz w:val="18"/>
+                <w:szCs w:val="18"/>
+              </w:rPr>
+              <w:t xml:space="preserve">ETV 216i</w:t>
+            </w:r>
+          </w:p>
+        </w:tc>
+        <w:tc>
+          <w:tcPr>
+            <w:tcW w:type="dxa" w:w="5089"/>
+            <w:tcBorders>
+              <w:top w:val="single" w:color="D9D9D9" w:sz="4"/>
+              <w:left w:val="single" w:color="D9D9D9" w:sz="4"/>
+              <w:bottom w:val="single" w:color="D9D9D9" w:sz="4"/>
+              <w:right w:val="single" w:color="D9D9D9" w:sz="4"/>
+            </w:tcBorders>
+            <w:tcMar>
+              <w:top w:type="dxa" w:w="50"/>
+              <w:left w:type="dxa" w:w="90"/>
+              <w:bottom w:type="dxa" w:w="50"/>
+              <w:right w:type="dxa" w:w="90"/>
+            </w:tcMar>
+          </w:tcPr>
+          <w:p>
+            <w:pPr>
+              <w:spacing w:after="0" w:before="0"/>
+            </w:pPr>
+            <w:r>
+              <w:rPr>
+                <w:color w:val="1A1A1A"/>
+                <w:sz w:val="18"/>
+                <w:szCs w:val="18"/>
+              </w:rPr>
+              <w:t xml:space="preserve">Jungheinrich reach truck: puts pallets away in the racks (lifts up to 10.7 m) and refills the fast-pick area</w:t>
+            </w:r>
+          </w:p>
+        </w:tc>
+      </w:tr>
+      <w:tr>
+        <w:trPr>
+          <w:cantSplit/>
+          <w:tblHeader w:val="false"/>
+        </w:trPr>
+        <w:tc>
+          <w:tcPr>
+            <w:tcW w:type="dxa" w:w="4549"/>
+            <w:tcBorders>
+              <w:top w:val="single" w:color="D9D9D9" w:sz="4"/>
+              <w:left w:val="single" w:color="D9D9D9" w:sz="4"/>
+              <w:bottom w:val="single" w:color="D9D9D9" w:sz="4"/>
+              <w:right w:val="single" w:color="D9D9D9" w:sz="4"/>
+            </w:tcBorders>
+            <w:tcMar>
+              <w:top w:type="dxa" w:w="50"/>
+              <w:left w:type="dxa" w:w="90"/>
+              <w:bottom w:type="dxa" w:w="50"/>
+              <w:right w:type="dxa" w:w="90"/>
+            </w:tcMar>
+          </w:tcPr>
+          <w:p>
+            <w:pPr>
+              <w:spacing w:after="0" w:before="0"/>
+            </w:pPr>
+            <w:r>
+              <w:rPr>
+                <w:color w:val="1A1A1A"/>
+                <w:sz w:val="18"/>
+                <w:szCs w:val="18"/>
+              </w:rPr>
+              <w:t xml:space="preserve">EJE 120i</w:t>
+            </w:r>
+          </w:p>
+        </w:tc>
+        <w:tc>
+          <w:tcPr>
+            <w:tcW w:type="dxa" w:w="5089"/>
+            <w:tcBorders>
+              <w:top w:val="single" w:color="D9D9D9" w:sz="4"/>
+              <w:left w:val="single" w:color="D9D9D9" w:sz="4"/>
+              <w:bottom w:val="single" w:color="D9D9D9" w:sz="4"/>
+              <w:right w:val="single" w:color="D9D9D9" w:sz="4"/>
+            </w:tcBorders>
+            <w:tcMar>
+              <w:top w:type="dxa" w:w="50"/>
+              <w:left w:type="dxa" w:w="90"/>
+              <w:bottom w:type="dxa" w:w="50"/>
+              <w:right w:type="dxa" w:w="90"/>
+            </w:tcMar>
+          </w:tcPr>
+          <w:p>
+            <w:pPr>
+              <w:spacing w:after="0" w:before="0"/>
+            </w:pPr>
+            <w:r>
+              <w:rPr>
+                <w:color w:val="1A1A1A"/>
+                <w:sz w:val="18"/>
+                <w:szCs w:val="18"/>
+              </w:rPr>
+              <w:t xml:space="preserve">Jungheinrich walkie pallet truck (the operator walks with it): used to pick large orders onto a pallet</w:t>
+            </w:r>
+          </w:p>
+        </w:tc>
+      </w:tr>
+      <w:tr>
+        <w:trPr>
+          <w:cantSplit/>
+          <w:tblHeader w:val="false"/>
+        </w:trPr>
+        <w:tc>
+          <w:tcPr>
+            <w:tcW w:type="dxa" w:w="4549"/>
+            <w:tcBorders>
+              <w:top w:val="single" w:color="D9D9D9" w:sz="4"/>
+              <w:left w:val="single" w:color="D9D9D9" w:sz="4"/>
+              <w:bottom w:val="single" w:color="D9D9D9" w:sz="4"/>
+              <w:right w:val="single" w:color="D9D9D9" w:sz="4"/>
+            </w:tcBorders>
+            <w:tcMar>
+              <w:top w:type="dxa" w:w="50"/>
+              <w:left w:type="dxa" w:w="90"/>
+              <w:bottom w:type="dxa" w:w="50"/>
+              <w:right w:type="dxa" w:w="90"/>
+            </w:tcMar>
+          </w:tcPr>
+          <w:p>
+            <w:pPr>
+              <w:spacing w:after="0" w:before="0"/>
+            </w:pPr>
+            <w:r>
+              <w:rPr>
+                <w:color w:val="1A1A1A"/>
+                <w:sz w:val="18"/>
+                <w:szCs w:val="18"/>
+              </w:rPr>
+              <w:t xml:space="preserve">ERE 225</w:t>
+            </w:r>
+          </w:p>
+        </w:tc>
+        <w:tc>
+          <w:tcPr>
+            <w:tcW w:type="dxa" w:w="5089"/>
+            <w:tcBorders>
+              <w:top w:val="single" w:color="D9D9D9" w:sz="4"/>
+              <w:left w:val="single" w:color="D9D9D9" w:sz="4"/>
+              <w:bottom w:val="single" w:color="D9D9D9" w:sz="4"/>
+              <w:right w:val="single" w:color="D9D9D9" w:sz="4"/>
+            </w:tcBorders>
+            <w:tcMar>
+              <w:top w:type="dxa" w:w="50"/>
+              <w:left w:type="dxa" w:w="90"/>
+              <w:bottom w:type="dxa" w:w="50"/>
+              <w:right w:type="dxa" w:w="90"/>
+            </w:tcMar>
+          </w:tcPr>
+          <w:p>
+            <w:pPr>
+              <w:spacing w:after="0" w:before="0"/>
+            </w:pPr>
+            <w:r>
+              <w:rPr>
+                <w:color w:val="1A1A1A"/>
+                <w:sz w:val="18"/>
+                <w:szCs w:val="18"/>
+              </w:rPr>
+              <w:t xml:space="preserve">Jungheinrich rider pallet truck (the operator stands on it): used to unload and load trailers</w:t>
+            </w:r>
+          </w:p>
+        </w:tc>
+      </w:tr>
+      <w:tr>
+        <w:trPr>
+          <w:cantSplit/>
+          <w:tblHeader w:val="false"/>
+        </w:trPr>
+        <w:tc>
+          <w:tcPr>
+            <w:tcW w:type="dxa" w:w="4549"/>
+            <w:tcBorders>
+              <w:top w:val="single" w:color="D9D9D9" w:sz="4"/>
+              <w:left w:val="single" w:color="D9D9D9" w:sz="4"/>
+              <w:bottom w:val="single" w:color="D9D9D9" w:sz="4"/>
+              <w:right w:val="single" w:color="D9D9D9" w:sz="4"/>
+            </w:tcBorders>
+            <w:tcMar>
+              <w:top w:type="dxa" w:w="50"/>
+              <w:left w:type="dxa" w:w="90"/>
+              <w:bottom w:type="dxa" w:w="50"/>
+              <w:right w:type="dxa" w:w="90"/>
+            </w:tcMar>
+          </w:tcPr>
+          <w:p>
+            <w:pPr>
+              <w:spacing w:after="0" w:before="0"/>
+            </w:pPr>
+            <w:r>
+              <w:rPr>
+                <w:color w:val="1A1A1A"/>
+                <w:sz w:val="18"/>
+                <w:szCs w:val="18"/>
+              </w:rPr>
+              <w:t xml:space="preserve">CAPEX</w:t>
+            </w:r>
+          </w:p>
+        </w:tc>
+        <w:tc>
+          <w:tcPr>
+            <w:tcW w:type="dxa" w:w="5089"/>
+            <w:tcBorders>
+              <w:top w:val="single" w:color="D9D9D9" w:sz="4"/>
+              <w:left w:val="single" w:color="D9D9D9" w:sz="4"/>
+              <w:bottom w:val="single" w:color="D9D9D9" w:sz="4"/>
+              <w:right w:val="single" w:color="D9D9D9" w:sz="4"/>
+            </w:tcBorders>
+            <w:tcMar>
+              <w:top w:type="dxa" w:w="50"/>
+              <w:left w:type="dxa" w:w="90"/>
+              <w:bottom w:type="dxa" w:w="50"/>
+              <w:right w:type="dxa" w:w="90"/>
+            </w:tcMar>
+          </w:tcPr>
+          <w:p>
+            <w:pPr>
+              <w:spacing w:after="0" w:before="0"/>
+            </w:pPr>
+            <w:r>
+              <w:rPr>
+                <w:color w:val="1A1A1A"/>
+                <w:sz w:val="18"/>
+                <w:szCs w:val="18"/>
+              </w:rPr>
+              <w:t xml:space="preserve">one-off investment: racks, equipment, set-up</w:t>
+            </w:r>
+          </w:p>
+        </w:tc>
+      </w:tr>
+      <w:tr>
+        <w:trPr>
+          <w:cantSplit/>
+          <w:tblHeader w:val="false"/>
+        </w:trPr>
+        <w:tc>
+          <w:tcPr>
+            <w:tcW w:type="dxa" w:w="4549"/>
+            <w:tcBorders>
+              <w:top w:val="single" w:color="D9D9D9" w:sz="4"/>
+              <w:left w:val="single" w:color="D9D9D9" w:sz="4"/>
+              <w:bottom w:val="single" w:color="D9D9D9" w:sz="4"/>
+              <w:right w:val="single" w:color="D9D9D9" w:sz="4"/>
+            </w:tcBorders>
+            <w:tcMar>
+              <w:top w:type="dxa" w:w="50"/>
+              <w:left w:type="dxa" w:w="90"/>
+              <w:bottom w:type="dxa" w:w="50"/>
+              <w:right w:type="dxa" w:w="90"/>
+            </w:tcMar>
+          </w:tcPr>
+          <w:p>
+            <w:pPr>
+              <w:spacing w:after="0" w:before="0"/>
+            </w:pPr>
+            <w:r>
+              <w:rPr>
+                <w:color w:val="1A1A1A"/>
+                <w:sz w:val="18"/>
+                <w:szCs w:val="18"/>
+              </w:rPr>
+              <w:t xml:space="preserve">OPEX</w:t>
+            </w:r>
+          </w:p>
+        </w:tc>
+        <w:tc>
+          <w:tcPr>
+            <w:tcW w:type="dxa" w:w="5089"/>
+            <w:tcBorders>
+              <w:top w:val="single" w:color="D9D9D9" w:sz="4"/>
+              <w:left w:val="single" w:color="D9D9D9" w:sz="4"/>
+              <w:bottom w:val="single" w:color="D9D9D9" w:sz="4"/>
+              <w:right w:val="single" w:color="D9D9D9" w:sz="4"/>
+            </w:tcBorders>
+            <w:tcMar>
+              <w:top w:type="dxa" w:w="50"/>
+              <w:left w:type="dxa" w:w="90"/>
+              <w:bottom w:type="dxa" w:w="50"/>
+              <w:right w:type="dxa" w:w="90"/>
+            </w:tcMar>
+          </w:tcPr>
+          <w:p>
+            <w:pPr>
+              <w:spacing w:after="0" w:before="0"/>
+            </w:pPr>
+            <w:r>
+              <w:rPr>
+                <w:color w:val="1A1A1A"/>
+                <w:sz w:val="18"/>
+                <w:szCs w:val="18"/>
+              </w:rPr>
+              <w:t xml:space="preserve">running cost every year: staff, truck lease, energy, upkeep</w:t>
+            </w:r>
+          </w:p>
+        </w:tc>
+      </w:tr>
+      <w:tr>
+        <w:trPr>
+          <w:cantSplit/>
+          <w:tblHeader w:val="false"/>
+        </w:trPr>
+        <w:tc>
+          <w:tcPr>
+            <w:tcW w:type="dxa" w:w="4549"/>
+            <w:tcBorders>
+              <w:top w:val="single" w:color="D9D9D9" w:sz="4"/>
+              <w:left w:val="single" w:color="D9D9D9" w:sz="4"/>
+              <w:bottom w:val="single" w:color="D9D9D9" w:sz="4"/>
+              <w:right w:val="single" w:color="D9D9D9" w:sz="4"/>
+            </w:tcBorders>
+            <w:tcMar>
+              <w:top w:type="dxa" w:w="50"/>
+              <w:left w:type="dxa" w:w="90"/>
+              <w:bottom w:type="dxa" w:w="50"/>
+              <w:right w:type="dxa" w:w="90"/>
+            </w:tcMar>
+          </w:tcPr>
+          <w:p>
+            <w:pPr>
+              <w:spacing w:after="0" w:before="0"/>
+            </w:pPr>
+            <w:r>
+              <w:rPr>
+                <w:color w:val="1A1A1A"/>
+                <w:sz w:val="18"/>
+                <w:szCs w:val="18"/>
+              </w:rPr>
+              <w:t xml:space="preserve">Depreciation</w:t>
+            </w:r>
+          </w:p>
+        </w:tc>
+        <w:tc>
+          <w:tcPr>
+            <w:tcW w:type="dxa" w:w="5089"/>
+            <w:tcBorders>
+              <w:top w:val="single" w:color="D9D9D9" w:sz="4"/>
+              <w:left w:val="single" w:color="D9D9D9" w:sz="4"/>
+              <w:bottom w:val="single" w:color="D9D9D9" w:sz="4"/>
+              <w:right w:val="single" w:color="D9D9D9" w:sz="4"/>
+            </w:tcBorders>
+            <w:tcMar>
+              <w:top w:type="dxa" w:w="50"/>
+              <w:left w:type="dxa" w:w="90"/>
+              <w:bottom w:type="dxa" w:w="50"/>
+              <w:right w:type="dxa" w:w="90"/>
+            </w:tcMar>
+          </w:tcPr>
+          <w:p>
+            <w:pPr>
+              <w:spacing w:after="0" w:before="0"/>
+            </w:pPr>
+            <w:r>
+              <w:rPr>
+                <w:color w:val="1A1A1A"/>
+                <w:sz w:val="18"/>
+                <w:szCs w:val="18"/>
+              </w:rPr>
+              <w:t xml:space="preserve">the investment spread over the years it lasts (racks 15 years, equipment 7, IT 5)</w:t>
+            </w:r>
+          </w:p>
+        </w:tc>
+      </w:tr>
+      <w:tr>
+        <w:trPr>
+          <w:cantSplit/>
+          <w:tblHeader w:val="false"/>
+        </w:trPr>
+        <w:tc>
+          <w:tcPr>
+            <w:tcW w:type="dxa" w:w="4549"/>
+            <w:tcBorders>
+              <w:top w:val="single" w:color="D9D9D9" w:sz="4"/>
+              <w:left w:val="single" w:color="D9D9D9" w:sz="4"/>
+              <w:bottom w:val="single" w:color="D9D9D9" w:sz="4"/>
+              <w:right w:val="single" w:color="D9D9D9" w:sz="4"/>
+            </w:tcBorders>
+            <w:tcMar>
+              <w:top w:type="dxa" w:w="50"/>
+              <w:left w:type="dxa" w:w="90"/>
+              <w:bottom w:type="dxa" w:w="50"/>
+              <w:right w:type="dxa" w:w="90"/>
+            </w:tcMar>
+          </w:tcPr>
+          <w:p>
+            <w:pPr>
+              <w:spacing w:after="0" w:before="0"/>
+            </w:pPr>
+            <w:r>
+              <w:rPr>
+                <w:color w:val="1A1A1A"/>
+                <w:sz w:val="18"/>
+                <w:szCs w:val="18"/>
+              </w:rPr>
+              <w:t xml:space="preserve">Payback</w:t>
+            </w:r>
+          </w:p>
+        </w:tc>
+        <w:tc>
+          <w:tcPr>
+            <w:tcW w:type="dxa" w:w="5089"/>
+            <w:tcBorders>
+              <w:top w:val="single" w:color="D9D9D9" w:sz="4"/>
+              <w:left w:val="single" w:color="D9D9D9" w:sz="4"/>
+              <w:bottom w:val="single" w:color="D9D9D9" w:sz="4"/>
+              <w:right w:val="single" w:color="D9D9D9" w:sz="4"/>
+            </w:tcBorders>
+            <w:tcMar>
+              <w:top w:type="dxa" w:w="50"/>
+              <w:left w:type="dxa" w:w="90"/>
+              <w:bottom w:type="dxa" w:w="50"/>
+              <w:right w:type="dxa" w:w="90"/>
+            </w:tcMar>
+          </w:tcPr>
+          <w:p>
+            <w:pPr>
+              <w:spacing w:after="0" w:before="0"/>
+            </w:pPr>
+            <w:r>
+              <w:rPr>
+                <w:color w:val="1A1A1A"/>
+                <w:sz w:val="18"/>
+                <w:szCs w:val="18"/>
+              </w:rPr>
+              <w:t xml:space="preserve">how many years of savings it takes to earn back an investment</w:t>
+            </w:r>
+          </w:p>
+        </w:tc>
+      </w:tr>
+      <w:tr>
+        <w:trPr>
+          <w:cantSplit/>
+          <w:tblHeader w:val="false"/>
+        </w:trPr>
+        <w:tc>
+          <w:tcPr>
+            <w:tcW w:type="dxa" w:w="4549"/>
+            <w:tcBorders>
+              <w:top w:val="single" w:color="D9D9D9" w:sz="4"/>
+              <w:left w:val="single" w:color="D9D9D9" w:sz="4"/>
+              <w:bottom w:val="single" w:color="D9D9D9" w:sz="4"/>
+              <w:right w:val="single" w:color="D9D9D9" w:sz="4"/>
+            </w:tcBorders>
+            <w:tcMar>
+              <w:top w:type="dxa" w:w="50"/>
+              <w:left w:type="dxa" w:w="90"/>
+              <w:bottom w:type="dxa" w:w="50"/>
+              <w:right w:type="dxa" w:w="90"/>
+            </w:tcMar>
+          </w:tcPr>
+          <w:p>
+            <w:pPr>
+              <w:spacing w:after="0" w:before="0"/>
+            </w:pPr>
+            <w:r>
+              <w:rPr>
+                <w:color w:val="1A1A1A"/>
+                <w:sz w:val="18"/>
+                <w:szCs w:val="18"/>
+              </w:rPr>
+              <w:t xml:space="preserve">Sensitivity</w:t>
+            </w:r>
+          </w:p>
+        </w:tc>
+        <w:tc>
+          <w:tcPr>
+            <w:tcW w:type="dxa" w:w="5089"/>
+            <w:tcBorders>
+              <w:top w:val="single" w:color="D9D9D9" w:sz="4"/>
+              <w:left w:val="single" w:color="D9D9D9" w:sz="4"/>
+              <w:bottom w:val="single" w:color="D9D9D9" w:sz="4"/>
+              <w:right w:val="single" w:color="D9D9D9" w:sz="4"/>
+            </w:tcBorders>
+            <w:tcMar>
+              <w:top w:type="dxa" w:w="50"/>
+              <w:left w:type="dxa" w:w="90"/>
+              <w:bottom w:type="dxa" w:w="50"/>
+              <w:right w:type="dxa" w:w="90"/>
+            </w:tcMar>
+          </w:tcPr>
+          <w:p>
+            <w:pPr>
+              <w:spacing w:after="0" w:before="0"/>
+            </w:pPr>
+            <w:r>
+              <w:rPr>
+                <w:color w:val="1A1A1A"/>
+                <w:sz w:val="18"/>
+                <w:szCs w:val="18"/>
+              </w:rPr>
+              <w:t xml:space="preserve">how much the result changes if an assumption is wrong (e.g. labour at €28 instead of €20 an hour)</w:t>
+            </w:r>
+          </w:p>
+        </w:tc>
+      </w:tr>
+      <w:tr>
+        <w:trPr>
+          <w:cantSplit/>
+          <w:tblHeader w:val="false"/>
+        </w:trPr>
+        <w:tc>
+          <w:tcPr>
+            <w:tcW w:type="dxa" w:w="4549"/>
+            <w:tcBorders>
+              <w:top w:val="single" w:color="D9D9D9" w:sz="4"/>
+              <w:left w:val="single" w:color="D9D9D9" w:sz="4"/>
+              <w:bottom w:val="single" w:color="D9D9D9" w:sz="4"/>
+              <w:right w:val="single" w:color="D9D9D9" w:sz="4"/>
+            </w:tcBorders>
+            <w:tcMar>
+              <w:top w:type="dxa" w:w="50"/>
+              <w:left w:type="dxa" w:w="90"/>
+              <w:bottom w:type="dxa" w:w="50"/>
+              <w:right w:type="dxa" w:w="90"/>
+            </w:tcMar>
+          </w:tcPr>
+          <w:p>
+            <w:pPr>
+              <w:spacing w:after="0" w:before="0"/>
+            </w:pPr>
+            <w:r>
+              <w:rPr>
+                <w:color w:val="1A1A1A"/>
+                <w:sz w:val="18"/>
+                <w:szCs w:val="18"/>
+              </w:rPr>
+              <w:t xml:space="preserve">Stress test</w:t>
+            </w:r>
+          </w:p>
+        </w:tc>
+        <w:tc>
+          <w:tcPr>
+            <w:tcW w:type="dxa" w:w="5089"/>
+            <w:tcBorders>
+              <w:top w:val="single" w:color="D9D9D9" w:sz="4"/>
+              <w:left w:val="single" w:color="D9D9D9" w:sz="4"/>
+              <w:bottom w:val="single" w:color="D9D9D9" w:sz="4"/>
+              <w:right w:val="single" w:color="D9D9D9" w:sz="4"/>
+            </w:tcBorders>
+            <w:tcMar>
+              <w:top w:type="dxa" w:w="50"/>
+              <w:left w:type="dxa" w:w="90"/>
+              <w:bottom w:type="dxa" w:w="50"/>
+              <w:right w:type="dxa" w:w="90"/>
+            </w:tcMar>
+          </w:tcPr>
+          <w:p>
+            <w:pPr>
+              <w:spacing w:after="0" w:before="0"/>
+            </w:pPr>
+            <w:r>
+              <w:rPr>
+                <w:color w:val="1A1A1A"/>
+                <w:sz w:val="18"/>
+                <w:szCs w:val="18"/>
+              </w:rPr>
+              <w:t xml:space="preserve">checking the design at 150%, 200% and 250% of today's volume</w:t>
             </w:r>
           </w:p>
         </w:tc>

</xml_diff>